<commit_message>
Polish dashboard UI: loading and connection states, smooth animations, feedback
- connecting spinner and connected pulse, empty state, slide-in alert banner,
  animated alert rows, stat-number feedback, hover states, 8pt spacing and type scale,
  stronger contrast, reduced-motion support
- refresh report and presentation screenshots to match
- add final viva guide
</commit_message>
<xml_diff>
--- a/report/NIDS_Mini_Project_Report.docx
+++ b/report/NIDS_Mini_Project_Report.docx
@@ -23411,7 +23411,7 @@
           <w:rFonts w:ascii="Consolas" w:hAnsi="Consolas" w:eastAsia="Consolas" w:cs="Consolas"/>
           <w:sz w:val="17"/>
         </w:rPr>
-        <w:t>&lt;html&gt;</w:t>
+        <w:t>&lt;html lang="en"&gt;</w:t>
       </w:r>
     </w:p>
     <w:p>
@@ -23445,6 +23445,40 @@
           <w:rFonts w:ascii="Consolas" w:hAnsi="Consolas" w:eastAsia="Consolas" w:cs="Consolas"/>
           <w:sz w:val="17"/>
         </w:rPr>
+        <w:t xml:space="preserve">  &lt;meta charset="utf-8"&gt;</w:t>
+      </w:r>
+    </w:p>
+    <w:p>
+      <w:pPr>
+        <w:keepNext w:val="0"/>
+        <w:keepLines w:val="0"/>
+        <w:pageBreakBefore w:val="0"/>
+        <w:widowControl/>
+        <w:spacing w:line="240" w:lineRule="auto" w:before="0" w:after="0"/>
+        <w:jc w:val="left"/>
+      </w:pPr>
+      <w:r>
+        <w:rPr>
+          <w:rFonts w:ascii="Consolas" w:hAnsi="Consolas" w:eastAsia="Consolas" w:cs="Consolas"/>
+          <w:sz w:val="17"/>
+        </w:rPr>
+        <w:t xml:space="preserve">  &lt;meta name="viewport" content="width=device-width, initial-scale=1"&gt;</w:t>
+      </w:r>
+    </w:p>
+    <w:p>
+      <w:pPr>
+        <w:keepNext w:val="0"/>
+        <w:keepLines w:val="0"/>
+        <w:pageBreakBefore w:val="0"/>
+        <w:widowControl/>
+        <w:spacing w:line="240" w:lineRule="auto" w:before="0" w:after="0"/>
+        <w:jc w:val="left"/>
+      </w:pPr>
+      <w:r>
+        <w:rPr>
+          <w:rFonts w:ascii="Consolas" w:hAnsi="Consolas" w:eastAsia="Consolas" w:cs="Consolas"/>
+          <w:sz w:val="17"/>
+        </w:rPr>
         <w:t xml:space="preserve">  &lt;title&gt;NIDS Dashboard&lt;/title&gt;</w:t>
       </w:r>
     </w:p>
@@ -23479,313 +23513,1503 @@
           <w:rFonts w:ascii="Consolas" w:hAnsi="Consolas" w:eastAsia="Consolas" w:cs="Consolas"/>
           <w:sz w:val="17"/>
         </w:rPr>
-        <w:t xml:space="preserve">    body { font-family: Arial, sans-serif; margin: 30px; background: #f4f6f8; color: #1f2937; }</w:t>
-      </w:r>
-    </w:p>
-    <w:p>
-      <w:pPr>
-        <w:keepNext w:val="0"/>
-        <w:keepLines w:val="0"/>
-        <w:pageBreakBefore w:val="0"/>
-        <w:widowControl/>
-        <w:spacing w:line="240" w:lineRule="auto" w:before="0" w:after="0"/>
-        <w:jc w:val="left"/>
-      </w:pPr>
-      <w:r>
-        <w:rPr>
-          <w:rFonts w:ascii="Consolas" w:hAnsi="Consolas" w:eastAsia="Consolas" w:cs="Consolas"/>
-          <w:sz w:val="17"/>
-        </w:rPr>
-        <w:t xml:space="preserve">    h1 { margin: 0 0 4px 0; }</w:t>
-      </w:r>
-    </w:p>
-    <w:p>
-      <w:pPr>
-        <w:keepNext w:val="0"/>
-        <w:keepLines w:val="0"/>
-        <w:pageBreakBefore w:val="0"/>
-        <w:widowControl/>
-        <w:spacing w:line="240" w:lineRule="auto" w:before="0" w:after="0"/>
-        <w:jc w:val="left"/>
-      </w:pPr>
-      <w:r>
-        <w:rPr>
-          <w:rFonts w:ascii="Consolas" w:hAnsi="Consolas" w:eastAsia="Consolas" w:cs="Consolas"/>
-          <w:sz w:val="17"/>
-        </w:rPr>
-        <w:t xml:space="preserve">    #status { color: #6b7280; margin-bottom: 20px; }</w:t>
-      </w:r>
-    </w:p>
-    <w:p>
-      <w:pPr>
-        <w:keepNext w:val="0"/>
-        <w:keepLines w:val="0"/>
-        <w:pageBreakBefore w:val="0"/>
-        <w:widowControl/>
-        <w:spacing w:line="240" w:lineRule="auto" w:before="0" w:after="0"/>
-        <w:jc w:val="left"/>
-      </w:pPr>
-      <w:r>
-        <w:rPr>
-          <w:rFonts w:ascii="Consolas" w:hAnsi="Consolas" w:eastAsia="Consolas" w:cs="Consolas"/>
-          <w:sz w:val="17"/>
-        </w:rPr>
-        <w:t xml:space="preserve">    #status.on { color: #1b7f73; }</w:t>
-      </w:r>
-    </w:p>
-    <w:p>
-      <w:pPr>
-        <w:keepNext w:val="0"/>
-        <w:keepLines w:val="0"/>
-        <w:pageBreakBefore w:val="0"/>
-        <w:widowControl/>
-        <w:spacing w:line="240" w:lineRule="auto" w:before="0" w:after="0"/>
-        <w:jc w:val="left"/>
-      </w:pPr>
-      <w:r>
-        <w:rPr>
-          <w:rFonts w:ascii="Consolas" w:hAnsi="Consolas" w:eastAsia="Consolas" w:cs="Consolas"/>
-          <w:sz w:val="17"/>
-        </w:rPr>
-        <w:t xml:space="preserve">    .row { display: flex; gap: 20px; align-items: flex-start; }</w:t>
-      </w:r>
-    </w:p>
-    <w:p>
-      <w:pPr>
-        <w:keepNext w:val="0"/>
-        <w:keepLines w:val="0"/>
-        <w:pageBreakBefore w:val="0"/>
-        <w:widowControl/>
-        <w:spacing w:line="240" w:lineRule="auto" w:before="0" w:after="0"/>
-        <w:jc w:val="left"/>
-      </w:pPr>
-      <w:r>
-        <w:rPr>
-          <w:rFonts w:ascii="Consolas" w:hAnsi="Consolas" w:eastAsia="Consolas" w:cs="Consolas"/>
-          <w:sz w:val="17"/>
-        </w:rPr>
-        <w:t xml:space="preserve">    .stats { display: flex; gap: 20px; }</w:t>
-      </w:r>
-    </w:p>
-    <w:p>
-      <w:pPr>
-        <w:keepNext w:val="0"/>
-        <w:keepLines w:val="0"/>
-        <w:pageBreakBefore w:val="0"/>
-        <w:widowControl/>
-        <w:spacing w:line="240" w:lineRule="auto" w:before="0" w:after="0"/>
-        <w:jc w:val="left"/>
-      </w:pPr>
-      <w:r>
-        <w:rPr>
-          <w:rFonts w:ascii="Consolas" w:hAnsi="Consolas" w:eastAsia="Consolas" w:cs="Consolas"/>
-          <w:sz w:val="17"/>
-        </w:rPr>
-        <w:t xml:space="preserve">    .stats div { background: white; padding: 20px 30px; border-radius: 8px; font-size: 18px; }</w:t>
-      </w:r>
-    </w:p>
-    <w:p>
-      <w:pPr>
-        <w:keepNext w:val="0"/>
-        <w:keepLines w:val="0"/>
-        <w:pageBreakBefore w:val="0"/>
-        <w:widowControl/>
-        <w:spacing w:line="240" w:lineRule="auto" w:before="0" w:after="0"/>
-        <w:jc w:val="left"/>
-      </w:pPr>
-      <w:r>
-        <w:rPr>
-          <w:rFonts w:ascii="Consolas" w:hAnsi="Consolas" w:eastAsia="Consolas" w:cs="Consolas"/>
-          <w:sz w:val="17"/>
-        </w:rPr>
-        <w:t xml:space="preserve">    .stats span { display: block; font-size: 36px; font-weight: bold; color: #1f4e79; }</w:t>
-      </w:r>
-    </w:p>
-    <w:p>
-      <w:pPr>
-        <w:keepNext w:val="0"/>
-        <w:keepLines w:val="0"/>
-        <w:pageBreakBefore w:val="0"/>
-        <w:widowControl/>
-        <w:spacing w:line="240" w:lineRule="auto" w:before="0" w:after="0"/>
-        <w:jc w:val="left"/>
-      </w:pPr>
-      <w:r>
-        <w:rPr>
-          <w:rFonts w:ascii="Consolas" w:hAnsi="Consolas" w:eastAsia="Consolas" w:cs="Consolas"/>
-          <w:sz w:val="17"/>
-        </w:rPr>
-        <w:t xml:space="preserve">    .chart { background: white; border-radius: 8px; padding: 10px; flex: 1; height: 150px; }</w:t>
-      </w:r>
-    </w:p>
-    <w:p>
-      <w:pPr>
-        <w:keepNext w:val="0"/>
-        <w:keepLines w:val="0"/>
-        <w:pageBreakBefore w:val="0"/>
-        <w:widowControl/>
-        <w:spacing w:line="240" w:lineRule="auto" w:before="0" w:after="0"/>
-        <w:jc w:val="left"/>
-      </w:pPr>
-      <w:r>
-        <w:rPr>
-          <w:rFonts w:ascii="Consolas" w:hAnsi="Consolas" w:eastAsia="Consolas" w:cs="Consolas"/>
-          <w:sz w:val="17"/>
-        </w:rPr>
-        <w:t xml:space="preserve">    #banner { color: white; padding: 15px; font-size: 20px; border-radius: 8px; margin-bottom: 20px; }</w:t>
-      </w:r>
-    </w:p>
-    <w:p>
-      <w:pPr>
-        <w:keepNext w:val="0"/>
-        <w:keepLines w:val="0"/>
-        <w:pageBreakBefore w:val="0"/>
-        <w:widowControl/>
-        <w:spacing w:line="240" w:lineRule="auto" w:before="0" w:after="0"/>
-        <w:jc w:val="left"/>
-      </w:pPr>
-      <w:r>
-        <w:rPr>
-          <w:rFonts w:ascii="Consolas" w:hAnsi="Consolas" w:eastAsia="Consolas" w:cs="Consolas"/>
-          <w:sz w:val="17"/>
-        </w:rPr>
-        <w:t xml:space="preserve">    .medium { background: #e08a00; }</w:t>
-      </w:r>
-    </w:p>
-    <w:p>
-      <w:pPr>
-        <w:keepNext w:val="0"/>
-        <w:keepLines w:val="0"/>
-        <w:pageBreakBefore w:val="0"/>
-        <w:widowControl/>
-        <w:spacing w:line="240" w:lineRule="auto" w:before="0" w:after="0"/>
-        <w:jc w:val="left"/>
-      </w:pPr>
-      <w:r>
-        <w:rPr>
-          <w:rFonts w:ascii="Consolas" w:hAnsi="Consolas" w:eastAsia="Consolas" w:cs="Consolas"/>
-          <w:sz w:val="17"/>
-        </w:rPr>
-        <w:t xml:space="preserve">    .high { background: #c62828; }</w:t>
-      </w:r>
-    </w:p>
-    <w:p>
-      <w:pPr>
-        <w:keepNext w:val="0"/>
-        <w:keepLines w:val="0"/>
-        <w:pageBreakBefore w:val="0"/>
-        <w:widowControl/>
-        <w:spacing w:line="240" w:lineRule="auto" w:before="0" w:after="0"/>
-        <w:jc w:val="left"/>
-      </w:pPr>
-      <w:r>
-        <w:rPr>
-          <w:rFonts w:ascii="Consolas" w:hAnsi="Consolas" w:eastAsia="Consolas" w:cs="Consolas"/>
-          <w:sz w:val="17"/>
-        </w:rPr>
-        <w:t xml:space="preserve">    .critical { background: #7b1fa2; }</w:t>
-      </w:r>
-    </w:p>
-    <w:p>
-      <w:pPr>
-        <w:keepNext w:val="0"/>
-        <w:keepLines w:val="0"/>
-        <w:pageBreakBefore w:val="0"/>
-        <w:widowControl/>
-        <w:spacing w:line="240" w:lineRule="auto" w:before="0" w:after="0"/>
-        <w:jc w:val="left"/>
-      </w:pPr>
-      <w:r>
-        <w:rPr>
-          <w:rFonts w:ascii="Consolas" w:hAnsi="Consolas" w:eastAsia="Consolas" w:cs="Consolas"/>
-          <w:sz w:val="17"/>
-        </w:rPr>
-        <w:t xml:space="preserve">    table { width: 100%; border-collapse: collapse; background: white; border-radius: 8px; }</w:t>
-      </w:r>
-    </w:p>
-    <w:p>
-      <w:pPr>
-        <w:keepNext w:val="0"/>
-        <w:keepLines w:val="0"/>
-        <w:pageBreakBefore w:val="0"/>
-        <w:widowControl/>
-        <w:spacing w:line="240" w:lineRule="auto" w:before="0" w:after="0"/>
-        <w:jc w:val="left"/>
-      </w:pPr>
-      <w:r>
-        <w:rPr>
-          <w:rFonts w:ascii="Consolas" w:hAnsi="Consolas" w:eastAsia="Consolas" w:cs="Consolas"/>
-          <w:sz w:val="17"/>
-        </w:rPr>
-        <w:t xml:space="preserve">    th, td { text-align: left; padding: 10px; border-bottom: 1px solid #e5e7eb; }</w:t>
-      </w:r>
-    </w:p>
-    <w:p>
-      <w:pPr>
-        <w:keepNext w:val="0"/>
-        <w:keepLines w:val="0"/>
-        <w:pageBreakBefore w:val="0"/>
-        <w:widowControl/>
-        <w:spacing w:line="240" w:lineRule="auto" w:before="0" w:after="0"/>
-        <w:jc w:val="left"/>
-      </w:pPr>
-      <w:r>
-        <w:rPr>
-          <w:rFonts w:ascii="Consolas" w:hAnsi="Consolas" w:eastAsia="Consolas" w:cs="Consolas"/>
-          <w:sz w:val="17"/>
-        </w:rPr>
-        <w:t xml:space="preserve">    th { background: #e8edf3; }</w:t>
-      </w:r>
-    </w:p>
-    <w:p>
-      <w:pPr>
-        <w:keepNext w:val="0"/>
-        <w:keepLines w:val="0"/>
-        <w:pageBreakBefore w:val="0"/>
-        <w:widowControl/>
-        <w:spacing w:line="240" w:lineRule="auto" w:before="0" w:after="0"/>
-        <w:jc w:val="left"/>
-      </w:pPr>
-      <w:r>
-        <w:rPr>
-          <w:rFonts w:ascii="Consolas" w:hAnsi="Consolas" w:eastAsia="Consolas" w:cs="Consolas"/>
-          <w:sz w:val="17"/>
-        </w:rPr>
-        <w:t xml:space="preserve">    .pill { color: white; font-weight: bold; text-transform: capitalize; padding: 3px 12px; border-radius: 12px; font-size: 14px; }</w:t>
-      </w:r>
-    </w:p>
-    <w:p>
-      <w:pPr>
-        <w:keepNext w:val="0"/>
-        <w:keepLines w:val="0"/>
-        <w:pageBreakBefore w:val="0"/>
-        <w:widowControl/>
-        <w:spacing w:line="240" w:lineRule="auto" w:before="0" w:after="0"/>
-        <w:jc w:val="left"/>
-      </w:pPr>
-      <w:r>
-        <w:rPr>
-          <w:rFonts w:ascii="Consolas" w:hAnsi="Consolas" w:eastAsia="Consolas" w:cs="Consolas"/>
-          <w:sz w:val="17"/>
-        </w:rPr>
-        <w:t xml:space="preserve">    .pill.medium { background: #e08a00; } .pill.high { background: #c62828; } .pill.critical { background: #7b1fa2; }</w:t>
-      </w:r>
-    </w:p>
-    <w:p>
-      <w:pPr>
-        <w:keepNext w:val="0"/>
-        <w:keepLines w:val="0"/>
-        <w:pageBreakBefore w:val="0"/>
-        <w:widowControl/>
-        <w:spacing w:line="240" w:lineRule="auto" w:before="0" w:after="0"/>
-        <w:jc w:val="left"/>
-      </w:pPr>
-      <w:r>
-        <w:rPr>
-          <w:rFonts w:ascii="Consolas" w:hAnsi="Consolas" w:eastAsia="Consolas" w:cs="Consolas"/>
-          <w:sz w:val="17"/>
-        </w:rPr>
-        <w:t xml:space="preserve">    .totals { margin: 10px 0 20px 0; color: #4b5563; }</w:t>
+        <w:t xml:space="preserve">    :root {</w:t>
+      </w:r>
+    </w:p>
+    <w:p>
+      <w:pPr>
+        <w:keepNext w:val="0"/>
+        <w:keepLines w:val="0"/>
+        <w:pageBreakBefore w:val="0"/>
+        <w:widowControl/>
+        <w:spacing w:line="240" w:lineRule="auto" w:before="0" w:after="0"/>
+        <w:jc w:val="left"/>
+      </w:pPr>
+      <w:r>
+        <w:rPr>
+          <w:rFonts w:ascii="Consolas" w:hAnsi="Consolas" w:eastAsia="Consolas" w:cs="Consolas"/>
+          <w:sz w:val="17"/>
+        </w:rPr>
+        <w:t xml:space="preserve">      --bg: #f4f6f8; --card: #ffffff; --ink: #1f2937; --muted: #5b6472;</w:t>
+      </w:r>
+    </w:p>
+    <w:p>
+      <w:pPr>
+        <w:keepNext w:val="0"/>
+        <w:keepLines w:val="0"/>
+        <w:pageBreakBefore w:val="0"/>
+        <w:widowControl/>
+        <w:spacing w:line="240" w:lineRule="auto" w:before="0" w:after="0"/>
+        <w:jc w:val="left"/>
+      </w:pPr>
+      <w:r>
+        <w:rPr>
+          <w:rFonts w:ascii="Consolas" w:hAnsi="Consolas" w:eastAsia="Consolas" w:cs="Consolas"/>
+          <w:sz w:val="17"/>
+        </w:rPr>
+        <w:t xml:space="preserve">      --line: #e5e7eb; --accent: #1f4e79; --head: #e8edf3;</w:t>
+      </w:r>
+    </w:p>
+    <w:p>
+      <w:pPr>
+        <w:keepNext w:val="0"/>
+        <w:keepLines w:val="0"/>
+        <w:pageBreakBefore w:val="0"/>
+        <w:widowControl/>
+        <w:spacing w:line="240" w:lineRule="auto" w:before="0" w:after="0"/>
+        <w:jc w:val="left"/>
+      </w:pPr>
+      <w:r>
+        <w:rPr>
+          <w:rFonts w:ascii="Consolas" w:hAnsi="Consolas" w:eastAsia="Consolas" w:cs="Consolas"/>
+          <w:sz w:val="17"/>
+        </w:rPr>
+        <w:t xml:space="preserve">      --medium: #e08a00; --high: #c62828; --critical: #7b1fa2; --on: #1b7f73;</w:t>
+      </w:r>
+    </w:p>
+    <w:p>
+      <w:pPr>
+        <w:keepNext w:val="0"/>
+        <w:keepLines w:val="0"/>
+        <w:pageBreakBefore w:val="0"/>
+        <w:widowControl/>
+        <w:spacing w:line="240" w:lineRule="auto" w:before="0" w:after="0"/>
+        <w:jc w:val="left"/>
+      </w:pPr>
+      <w:r>
+        <w:rPr>
+          <w:rFonts w:ascii="Consolas" w:hAnsi="Consolas" w:eastAsia="Consolas" w:cs="Consolas"/>
+          <w:sz w:val="17"/>
+        </w:rPr>
+        <w:t xml:space="preserve">      --s1: 8px; --s2: 16px; --s3: 24px; --s4: 32px;</w:t>
+      </w:r>
+    </w:p>
+    <w:p>
+      <w:pPr>
+        <w:keepNext w:val="0"/>
+        <w:keepLines w:val="0"/>
+        <w:pageBreakBefore w:val="0"/>
+        <w:widowControl/>
+        <w:spacing w:line="240" w:lineRule="auto" w:before="0" w:after="0"/>
+        <w:jc w:val="left"/>
+      </w:pPr>
+      <w:r>
+        <w:rPr>
+          <w:rFonts w:ascii="Consolas" w:hAnsi="Consolas" w:eastAsia="Consolas" w:cs="Consolas"/>
+          <w:sz w:val="17"/>
+        </w:rPr>
+        <w:t xml:space="preserve">      --radius: 10px; --shadow: 0 1px 3px rgba(16,24,40,.06), 0 1px 2px rgba(16,24,40,.04);</w:t>
+      </w:r>
+    </w:p>
+    <w:p>
+      <w:pPr>
+        <w:keepNext w:val="0"/>
+        <w:keepLines w:val="0"/>
+        <w:pageBreakBefore w:val="0"/>
+        <w:widowControl/>
+        <w:spacing w:line="240" w:lineRule="auto" w:before="0" w:after="0"/>
+        <w:jc w:val="left"/>
+      </w:pPr>
+      <w:r>
+        <w:rPr>
+          <w:rFonts w:ascii="Consolas" w:hAnsi="Consolas" w:eastAsia="Consolas" w:cs="Consolas"/>
+          <w:sz w:val="17"/>
+        </w:rPr>
+        <w:t xml:space="preserve">    }</w:t>
+      </w:r>
+    </w:p>
+    <w:p>
+      <w:pPr>
+        <w:keepNext w:val="0"/>
+        <w:keepLines w:val="0"/>
+        <w:pageBreakBefore w:val="0"/>
+        <w:widowControl/>
+        <w:spacing w:line="240" w:lineRule="auto" w:before="0" w:after="0"/>
+        <w:jc w:val="left"/>
+      </w:pPr>
+      <w:r>
+        <w:rPr>
+          <w:rFonts w:ascii="Consolas" w:hAnsi="Consolas" w:eastAsia="Consolas" w:cs="Consolas"/>
+          <w:sz w:val="17"/>
+        </w:rPr>
+        <w:t xml:space="preserve">    * { box-sizing: border-box; }</w:t>
+      </w:r>
+    </w:p>
+    <w:p>
+      <w:pPr>
+        <w:keepNext w:val="0"/>
+        <w:keepLines w:val="0"/>
+        <w:pageBreakBefore w:val="0"/>
+        <w:widowControl/>
+        <w:spacing w:line="240" w:lineRule="auto" w:before="0" w:after="0"/>
+        <w:jc w:val="left"/>
+      </w:pPr>
+      <w:r>
+        <w:rPr>
+          <w:rFonts w:ascii="Consolas" w:hAnsi="Consolas" w:eastAsia="Consolas" w:cs="Consolas"/>
+          <w:sz w:val="17"/>
+        </w:rPr>
+        <w:t xml:space="preserve">    body {</w:t>
+      </w:r>
+    </w:p>
+    <w:p>
+      <w:pPr>
+        <w:keepNext w:val="0"/>
+        <w:keepLines w:val="0"/>
+        <w:pageBreakBefore w:val="0"/>
+        <w:widowControl/>
+        <w:spacing w:line="240" w:lineRule="auto" w:before="0" w:after="0"/>
+        <w:jc w:val="left"/>
+      </w:pPr>
+      <w:r>
+        <w:rPr>
+          <w:rFonts w:ascii="Consolas" w:hAnsi="Consolas" w:eastAsia="Consolas" w:cs="Consolas"/>
+          <w:sz w:val="17"/>
+        </w:rPr>
+        <w:t xml:space="preserve">      font-family: system-ui, "Segoe UI", Roboto, Arial, sans-serif;</w:t>
+      </w:r>
+    </w:p>
+    <w:p>
+      <w:pPr>
+        <w:keepNext w:val="0"/>
+        <w:keepLines w:val="0"/>
+        <w:pageBreakBefore w:val="0"/>
+        <w:widowControl/>
+        <w:spacing w:line="240" w:lineRule="auto" w:before="0" w:after="0"/>
+        <w:jc w:val="left"/>
+      </w:pPr>
+      <w:r>
+        <w:rPr>
+          <w:rFonts w:ascii="Consolas" w:hAnsi="Consolas" w:eastAsia="Consolas" w:cs="Consolas"/>
+          <w:sz w:val="17"/>
+        </w:rPr>
+        <w:t xml:space="preserve">      margin: 0; padding: var(--s4); background: var(--bg); color: var(--ink);</w:t>
+      </w:r>
+    </w:p>
+    <w:p>
+      <w:pPr>
+        <w:keepNext w:val="0"/>
+        <w:keepLines w:val="0"/>
+        <w:pageBreakBefore w:val="0"/>
+        <w:widowControl/>
+        <w:spacing w:line="240" w:lineRule="auto" w:before="0" w:after="0"/>
+        <w:jc w:val="left"/>
+      </w:pPr>
+      <w:r>
+        <w:rPr>
+          <w:rFonts w:ascii="Consolas" w:hAnsi="Consolas" w:eastAsia="Consolas" w:cs="Consolas"/>
+          <w:sz w:val="17"/>
+        </w:rPr>
+        <w:t xml:space="preserve">      -webkit-font-smoothing: antialiased;</w:t>
+      </w:r>
+    </w:p>
+    <w:p>
+      <w:pPr>
+        <w:keepNext w:val="0"/>
+        <w:keepLines w:val="0"/>
+        <w:pageBreakBefore w:val="0"/>
+        <w:widowControl/>
+        <w:spacing w:line="240" w:lineRule="auto" w:before="0" w:after="0"/>
+        <w:jc w:val="left"/>
+      </w:pPr>
+      <w:r>
+        <w:rPr>
+          <w:rFonts w:ascii="Consolas" w:hAnsi="Consolas" w:eastAsia="Consolas" w:cs="Consolas"/>
+          <w:sz w:val="17"/>
+        </w:rPr>
+        <w:t xml:space="preserve">    }</w:t>
+      </w:r>
+    </w:p>
+    <w:p>
+      <w:pPr>
+        <w:keepNext w:val="0"/>
+        <w:keepLines w:val="0"/>
+        <w:pageBreakBefore w:val="0"/>
+        <w:widowControl/>
+        <w:spacing w:line="240" w:lineRule="auto" w:before="0" w:after="0"/>
+        <w:jc w:val="left"/>
+      </w:pPr>
+      <w:r>
+        <w:rPr>
+          <w:rFonts w:ascii="Consolas" w:hAnsi="Consolas" w:eastAsia="Consolas" w:cs="Consolas"/>
+          <w:sz w:val="17"/>
+        </w:rPr>
+        <w:t xml:space="preserve">    h1 { margin: 0 0 var(--s1) 0; font-size: 28px; letter-spacing: -.01em; }</w:t>
+      </w:r>
+    </w:p>
+    <w:p>
+      <w:pPr>
+        <w:keepNext w:val="0"/>
+        <w:keepLines w:val="0"/>
+        <w:pageBreakBefore w:val="0"/>
+        <w:widowControl/>
+        <w:spacing w:line="240" w:lineRule="auto" w:before="0" w:after="0"/>
+        <w:jc w:val="left"/>
+      </w:pPr>
+      <w:r>
+        <w:rPr>
+          <w:rFonts w:ascii="Consolas" w:hAnsi="Consolas" w:eastAsia="Consolas" w:cs="Consolas"/>
+          <w:sz w:val="17"/>
+        </w:rPr>
+        <w:t xml:space="preserve">    h2 { font-size: 15px; text-transform: uppercase; letter-spacing: .06em;</w:t>
+      </w:r>
+    </w:p>
+    <w:p>
+      <w:pPr>
+        <w:keepNext w:val="0"/>
+        <w:keepLines w:val="0"/>
+        <w:pageBreakBefore w:val="0"/>
+        <w:widowControl/>
+        <w:spacing w:line="240" w:lineRule="auto" w:before="0" w:after="0"/>
+        <w:jc w:val="left"/>
+      </w:pPr>
+      <w:r>
+        <w:rPr>
+          <w:rFonts w:ascii="Consolas" w:hAnsi="Consolas" w:eastAsia="Consolas" w:cs="Consolas"/>
+          <w:sz w:val="17"/>
+        </w:rPr>
+        <w:t xml:space="preserve">         color: var(--muted); margin: var(--s4) 0 var(--s2) 0; }</w:t>
+      </w:r>
+    </w:p>
+    <w:p>
+      <w:pPr>
+        <w:keepNext w:val="0"/>
+        <w:keepLines w:val="0"/>
+        <w:pageBreakBefore w:val="0"/>
+        <w:widowControl/>
+        <w:spacing w:line="240" w:lineRule="auto" w:before="0" w:after="0"/>
+        <w:jc w:val="left"/>
+      </w:pPr>
+      <w:r>
+        <w:rPr>
+          <w:rFonts w:ascii="Consolas" w:hAnsi="Consolas" w:eastAsia="Consolas" w:cs="Consolas"/>
+          <w:sz w:val="17"/>
+        </w:rPr>
+        <w:t xml:space="preserve"> </w:t>
+      </w:r>
+    </w:p>
+    <w:p>
+      <w:pPr>
+        <w:keepNext w:val="0"/>
+        <w:keepLines w:val="0"/>
+        <w:pageBreakBefore w:val="0"/>
+        <w:widowControl/>
+        <w:spacing w:line="240" w:lineRule="auto" w:before="0" w:after="0"/>
+        <w:jc w:val="left"/>
+      </w:pPr>
+      <w:r>
+        <w:rPr>
+          <w:rFonts w:ascii="Consolas" w:hAnsi="Consolas" w:eastAsia="Consolas" w:cs="Consolas"/>
+          <w:sz w:val="17"/>
+        </w:rPr>
+        <w:t xml:space="preserve">    /* status with a live dot */</w:t>
+      </w:r>
+    </w:p>
+    <w:p>
+      <w:pPr>
+        <w:keepNext w:val="0"/>
+        <w:keepLines w:val="0"/>
+        <w:pageBreakBefore w:val="0"/>
+        <w:widowControl/>
+        <w:spacing w:line="240" w:lineRule="auto" w:before="0" w:after="0"/>
+        <w:jc w:val="left"/>
+      </w:pPr>
+      <w:r>
+        <w:rPr>
+          <w:rFonts w:ascii="Consolas" w:hAnsi="Consolas" w:eastAsia="Consolas" w:cs="Consolas"/>
+          <w:sz w:val="17"/>
+        </w:rPr>
+        <w:t xml:space="preserve">    #status { display: flex; align-items: center; gap: var(--s1);</w:t>
+      </w:r>
+    </w:p>
+    <w:p>
+      <w:pPr>
+        <w:keepNext w:val="0"/>
+        <w:keepLines w:val="0"/>
+        <w:pageBreakBefore w:val="0"/>
+        <w:widowControl/>
+        <w:spacing w:line="240" w:lineRule="auto" w:before="0" w:after="0"/>
+        <w:jc w:val="left"/>
+      </w:pPr>
+      <w:r>
+        <w:rPr>
+          <w:rFonts w:ascii="Consolas" w:hAnsi="Consolas" w:eastAsia="Consolas" w:cs="Consolas"/>
+          <w:sz w:val="17"/>
+        </w:rPr>
+        <w:t xml:space="preserve">              color: var(--muted); font-size: 14px; margin-bottom: var(--s2); }</w:t>
+      </w:r>
+    </w:p>
+    <w:p>
+      <w:pPr>
+        <w:keepNext w:val="0"/>
+        <w:keepLines w:val="0"/>
+        <w:pageBreakBefore w:val="0"/>
+        <w:widowControl/>
+        <w:spacing w:line="240" w:lineRule="auto" w:before="0" w:after="0"/>
+        <w:jc w:val="left"/>
+      </w:pPr>
+      <w:r>
+        <w:rPr>
+          <w:rFonts w:ascii="Consolas" w:hAnsi="Consolas" w:eastAsia="Consolas" w:cs="Consolas"/>
+          <w:sz w:val="17"/>
+        </w:rPr>
+        <w:t xml:space="preserve">    .dot { width: 10px; height: 10px; border-radius: 50%; flex: none;</w:t>
+      </w:r>
+    </w:p>
+    <w:p>
+      <w:pPr>
+        <w:keepNext w:val="0"/>
+        <w:keepLines w:val="0"/>
+        <w:pageBreakBefore w:val="0"/>
+        <w:widowControl/>
+        <w:spacing w:line="240" w:lineRule="auto" w:before="0" w:after="0"/>
+        <w:jc w:val="left"/>
+      </w:pPr>
+      <w:r>
+        <w:rPr>
+          <w:rFonts w:ascii="Consolas" w:hAnsi="Consolas" w:eastAsia="Consolas" w:cs="Consolas"/>
+          <w:sz w:val="17"/>
+        </w:rPr>
+        <w:t xml:space="preserve">           background: var(--muted); transition: background .3s ease; }</w:t>
+      </w:r>
+    </w:p>
+    <w:p>
+      <w:pPr>
+        <w:keepNext w:val="0"/>
+        <w:keepLines w:val="0"/>
+        <w:pageBreakBefore w:val="0"/>
+        <w:widowControl/>
+        <w:spacing w:line="240" w:lineRule="auto" w:before="0" w:after="0"/>
+        <w:jc w:val="left"/>
+      </w:pPr>
+      <w:r>
+        <w:rPr>
+          <w:rFonts w:ascii="Consolas" w:hAnsi="Consolas" w:eastAsia="Consolas" w:cs="Consolas"/>
+          <w:sz w:val="17"/>
+        </w:rPr>
+        <w:t xml:space="preserve">    #status.connecting .dot {</w:t>
+      </w:r>
+    </w:p>
+    <w:p>
+      <w:pPr>
+        <w:keepNext w:val="0"/>
+        <w:keepLines w:val="0"/>
+        <w:pageBreakBefore w:val="0"/>
+        <w:widowControl/>
+        <w:spacing w:line="240" w:lineRule="auto" w:before="0" w:after="0"/>
+        <w:jc w:val="left"/>
+      </w:pPr>
+      <w:r>
+        <w:rPr>
+          <w:rFonts w:ascii="Consolas" w:hAnsi="Consolas" w:eastAsia="Consolas" w:cs="Consolas"/>
+          <w:sz w:val="17"/>
+        </w:rPr>
+        <w:t xml:space="preserve">      background: transparent; border: 2px solid var(--line);</w:t>
+      </w:r>
+    </w:p>
+    <w:p>
+      <w:pPr>
+        <w:keepNext w:val="0"/>
+        <w:keepLines w:val="0"/>
+        <w:pageBreakBefore w:val="0"/>
+        <w:widowControl/>
+        <w:spacing w:line="240" w:lineRule="auto" w:before="0" w:after="0"/>
+        <w:jc w:val="left"/>
+      </w:pPr>
+      <w:r>
+        <w:rPr>
+          <w:rFonts w:ascii="Consolas" w:hAnsi="Consolas" w:eastAsia="Consolas" w:cs="Consolas"/>
+          <w:sz w:val="17"/>
+        </w:rPr>
+        <w:t xml:space="preserve">      border-top-color: var(--accent); animation: spin .7s linear infinite;</w:t>
+      </w:r>
+    </w:p>
+    <w:p>
+      <w:pPr>
+        <w:keepNext w:val="0"/>
+        <w:keepLines w:val="0"/>
+        <w:pageBreakBefore w:val="0"/>
+        <w:widowControl/>
+        <w:spacing w:line="240" w:lineRule="auto" w:before="0" w:after="0"/>
+        <w:jc w:val="left"/>
+      </w:pPr>
+      <w:r>
+        <w:rPr>
+          <w:rFonts w:ascii="Consolas" w:hAnsi="Consolas" w:eastAsia="Consolas" w:cs="Consolas"/>
+          <w:sz w:val="17"/>
+        </w:rPr>
+        <w:t xml:space="preserve">    }</w:t>
+      </w:r>
+    </w:p>
+    <w:p>
+      <w:pPr>
+        <w:keepNext w:val="0"/>
+        <w:keepLines w:val="0"/>
+        <w:pageBreakBefore w:val="0"/>
+        <w:widowControl/>
+        <w:spacing w:line="240" w:lineRule="auto" w:before="0" w:after="0"/>
+        <w:jc w:val="left"/>
+      </w:pPr>
+      <w:r>
+        <w:rPr>
+          <w:rFonts w:ascii="Consolas" w:hAnsi="Consolas" w:eastAsia="Consolas" w:cs="Consolas"/>
+          <w:sz w:val="17"/>
+        </w:rPr>
+        <w:t xml:space="preserve">    #status.on .dot { background: var(--on); animation: pulse 2s ease-in-out infinite; }</w:t>
+      </w:r>
+    </w:p>
+    <w:p>
+      <w:pPr>
+        <w:keepNext w:val="0"/>
+        <w:keepLines w:val="0"/>
+        <w:pageBreakBefore w:val="0"/>
+        <w:widowControl/>
+        <w:spacing w:line="240" w:lineRule="auto" w:before="0" w:after="0"/>
+        <w:jc w:val="left"/>
+      </w:pPr>
+      <w:r>
+        <w:rPr>
+          <w:rFonts w:ascii="Consolas" w:hAnsi="Consolas" w:eastAsia="Consolas" w:cs="Consolas"/>
+          <w:sz w:val="17"/>
+        </w:rPr>
+        <w:t xml:space="preserve">    #status.off .dot { background: var(--high); }</w:t>
+      </w:r>
+    </w:p>
+    <w:p>
+      <w:pPr>
+        <w:keepNext w:val="0"/>
+        <w:keepLines w:val="0"/>
+        <w:pageBreakBefore w:val="0"/>
+        <w:widowControl/>
+        <w:spacing w:line="240" w:lineRule="auto" w:before="0" w:after="0"/>
+        <w:jc w:val="left"/>
+      </w:pPr>
+      <w:r>
+        <w:rPr>
+          <w:rFonts w:ascii="Consolas" w:hAnsi="Consolas" w:eastAsia="Consolas" w:cs="Consolas"/>
+          <w:sz w:val="17"/>
+        </w:rPr>
+        <w:t xml:space="preserve"> </w:t>
+      </w:r>
+    </w:p>
+    <w:p>
+      <w:pPr>
+        <w:keepNext w:val="0"/>
+        <w:keepLines w:val="0"/>
+        <w:pageBreakBefore w:val="0"/>
+        <w:widowControl/>
+        <w:spacing w:line="240" w:lineRule="auto" w:before="0" w:after="0"/>
+        <w:jc w:val="left"/>
+      </w:pPr>
+      <w:r>
+        <w:rPr>
+          <w:rFonts w:ascii="Consolas" w:hAnsi="Consolas" w:eastAsia="Consolas" w:cs="Consolas"/>
+          <w:sz w:val="17"/>
+        </w:rPr>
+        <w:t xml:space="preserve">    /* alert banner: collapses when empty, slides down on an alert */</w:t>
+      </w:r>
+    </w:p>
+    <w:p>
+      <w:pPr>
+        <w:keepNext w:val="0"/>
+        <w:keepLines w:val="0"/>
+        <w:pageBreakBefore w:val="0"/>
+        <w:widowControl/>
+        <w:spacing w:line="240" w:lineRule="auto" w:before="0" w:after="0"/>
+        <w:jc w:val="left"/>
+      </w:pPr>
+      <w:r>
+        <w:rPr>
+          <w:rFonts w:ascii="Consolas" w:hAnsi="Consolas" w:eastAsia="Consolas" w:cs="Consolas"/>
+          <w:sz w:val="17"/>
+        </w:rPr>
+        <w:t xml:space="preserve">    #banner {</w:t>
+      </w:r>
+    </w:p>
+    <w:p>
+      <w:pPr>
+        <w:keepNext w:val="0"/>
+        <w:keepLines w:val="0"/>
+        <w:pageBreakBefore w:val="0"/>
+        <w:widowControl/>
+        <w:spacing w:line="240" w:lineRule="auto" w:before="0" w:after="0"/>
+        <w:jc w:val="left"/>
+      </w:pPr>
+      <w:r>
+        <w:rPr>
+          <w:rFonts w:ascii="Consolas" w:hAnsi="Consolas" w:eastAsia="Consolas" w:cs="Consolas"/>
+          <w:sz w:val="17"/>
+        </w:rPr>
+        <w:t xml:space="preserve">      color: #fff; border-radius: var(--radius); font-size: 20px; font-weight: 600;</w:t>
+      </w:r>
+    </w:p>
+    <w:p>
+      <w:pPr>
+        <w:keepNext w:val="0"/>
+        <w:keepLines w:val="0"/>
+        <w:pageBreakBefore w:val="0"/>
+        <w:widowControl/>
+        <w:spacing w:line="240" w:lineRule="auto" w:before="0" w:after="0"/>
+        <w:jc w:val="left"/>
+      </w:pPr>
+      <w:r>
+        <w:rPr>
+          <w:rFonts w:ascii="Consolas" w:hAnsi="Consolas" w:eastAsia="Consolas" w:cs="Consolas"/>
+          <w:sz w:val="17"/>
+        </w:rPr>
+        <w:t xml:space="preserve">      overflow: hidden; max-height: 0; opacity: 0; padding: 0 var(--s2);</w:t>
+      </w:r>
+    </w:p>
+    <w:p>
+      <w:pPr>
+        <w:keepNext w:val="0"/>
+        <w:keepLines w:val="0"/>
+        <w:pageBreakBefore w:val="0"/>
+        <w:widowControl/>
+        <w:spacing w:line="240" w:lineRule="auto" w:before="0" w:after="0"/>
+        <w:jc w:val="left"/>
+      </w:pPr>
+      <w:r>
+        <w:rPr>
+          <w:rFonts w:ascii="Consolas" w:hAnsi="Consolas" w:eastAsia="Consolas" w:cs="Consolas"/>
+          <w:sz w:val="17"/>
+        </w:rPr>
+        <w:t xml:space="preserve">      margin-bottom: 0; transform: translateY(-6px);</w:t>
+      </w:r>
+    </w:p>
+    <w:p>
+      <w:pPr>
+        <w:keepNext w:val="0"/>
+        <w:keepLines w:val="0"/>
+        <w:pageBreakBefore w:val="0"/>
+        <w:widowControl/>
+        <w:spacing w:line="240" w:lineRule="auto" w:before="0" w:after="0"/>
+        <w:jc w:val="left"/>
+      </w:pPr>
+      <w:r>
+        <w:rPr>
+          <w:rFonts w:ascii="Consolas" w:hAnsi="Consolas" w:eastAsia="Consolas" w:cs="Consolas"/>
+          <w:sz w:val="17"/>
+        </w:rPr>
+        <w:t xml:space="preserve">      transition: max-height .35s ease, opacity .3s ease, padding .35s ease,</w:t>
+      </w:r>
+    </w:p>
+    <w:p>
+      <w:pPr>
+        <w:keepNext w:val="0"/>
+        <w:keepLines w:val="0"/>
+        <w:pageBreakBefore w:val="0"/>
+        <w:widowControl/>
+        <w:spacing w:line="240" w:lineRule="auto" w:before="0" w:after="0"/>
+        <w:jc w:val="left"/>
+      </w:pPr>
+      <w:r>
+        <w:rPr>
+          <w:rFonts w:ascii="Consolas" w:hAnsi="Consolas" w:eastAsia="Consolas" w:cs="Consolas"/>
+          <w:sz w:val="17"/>
+        </w:rPr>
+        <w:t xml:space="preserve">                  margin .35s ease, transform .3s ease;</w:t>
+      </w:r>
+    </w:p>
+    <w:p>
+      <w:pPr>
+        <w:keepNext w:val="0"/>
+        <w:keepLines w:val="0"/>
+        <w:pageBreakBefore w:val="0"/>
+        <w:widowControl/>
+        <w:spacing w:line="240" w:lineRule="auto" w:before="0" w:after="0"/>
+        <w:jc w:val="left"/>
+      </w:pPr>
+      <w:r>
+        <w:rPr>
+          <w:rFonts w:ascii="Consolas" w:hAnsi="Consolas" w:eastAsia="Consolas" w:cs="Consolas"/>
+          <w:sz w:val="17"/>
+        </w:rPr>
+        <w:t xml:space="preserve">    }</w:t>
+      </w:r>
+    </w:p>
+    <w:p>
+      <w:pPr>
+        <w:keepNext w:val="0"/>
+        <w:keepLines w:val="0"/>
+        <w:pageBreakBefore w:val="0"/>
+        <w:widowControl/>
+        <w:spacing w:line="240" w:lineRule="auto" w:before="0" w:after="0"/>
+        <w:jc w:val="left"/>
+      </w:pPr>
+      <w:r>
+        <w:rPr>
+          <w:rFonts w:ascii="Consolas" w:hAnsi="Consolas" w:eastAsia="Consolas" w:cs="Consolas"/>
+          <w:sz w:val="17"/>
+        </w:rPr>
+        <w:t xml:space="preserve">    #banner.show { max-height: 120px; opacity: 1; padding: var(--s2);</w:t>
+      </w:r>
+    </w:p>
+    <w:p>
+      <w:pPr>
+        <w:keepNext w:val="0"/>
+        <w:keepLines w:val="0"/>
+        <w:pageBreakBefore w:val="0"/>
+        <w:widowControl/>
+        <w:spacing w:line="240" w:lineRule="auto" w:before="0" w:after="0"/>
+        <w:jc w:val="left"/>
+      </w:pPr>
+      <w:r>
+        <w:rPr>
+          <w:rFonts w:ascii="Consolas" w:hAnsi="Consolas" w:eastAsia="Consolas" w:cs="Consolas"/>
+          <w:sz w:val="17"/>
+        </w:rPr>
+        <w:t xml:space="preserve">                   margin-bottom: var(--s3); transform: translateY(0); }</w:t>
+      </w:r>
+    </w:p>
+    <w:p>
+      <w:pPr>
+        <w:keepNext w:val="0"/>
+        <w:keepLines w:val="0"/>
+        <w:pageBreakBefore w:val="0"/>
+        <w:widowControl/>
+        <w:spacing w:line="240" w:lineRule="auto" w:before="0" w:after="0"/>
+        <w:jc w:val="left"/>
+      </w:pPr>
+      <w:r>
+        <w:rPr>
+          <w:rFonts w:ascii="Consolas" w:hAnsi="Consolas" w:eastAsia="Consolas" w:cs="Consolas"/>
+          <w:sz w:val="17"/>
+        </w:rPr>
+        <w:t xml:space="preserve">    #banner.medium { background: var(--medium); } #banner.high { background: var(--high); }</w:t>
+      </w:r>
+    </w:p>
+    <w:p>
+      <w:pPr>
+        <w:keepNext w:val="0"/>
+        <w:keepLines w:val="0"/>
+        <w:pageBreakBefore w:val="0"/>
+        <w:widowControl/>
+        <w:spacing w:line="240" w:lineRule="auto" w:before="0" w:after="0"/>
+        <w:jc w:val="left"/>
+      </w:pPr>
+      <w:r>
+        <w:rPr>
+          <w:rFonts w:ascii="Consolas" w:hAnsi="Consolas" w:eastAsia="Consolas" w:cs="Consolas"/>
+          <w:sz w:val="17"/>
+        </w:rPr>
+        <w:t xml:space="preserve">    #banner.critical { background: var(--critical); }</w:t>
+      </w:r>
+    </w:p>
+    <w:p>
+      <w:pPr>
+        <w:keepNext w:val="0"/>
+        <w:keepLines w:val="0"/>
+        <w:pageBreakBefore w:val="0"/>
+        <w:widowControl/>
+        <w:spacing w:line="240" w:lineRule="auto" w:before="0" w:after="0"/>
+        <w:jc w:val="left"/>
+      </w:pPr>
+      <w:r>
+        <w:rPr>
+          <w:rFonts w:ascii="Consolas" w:hAnsi="Consolas" w:eastAsia="Consolas" w:cs="Consolas"/>
+          <w:sz w:val="17"/>
+        </w:rPr>
+        <w:t xml:space="preserve"> </w:t>
+      </w:r>
+    </w:p>
+    <w:p>
+      <w:pPr>
+        <w:keepNext w:val="0"/>
+        <w:keepLines w:val="0"/>
+        <w:pageBreakBefore w:val="0"/>
+        <w:widowControl/>
+        <w:spacing w:line="240" w:lineRule="auto" w:before="0" w:after="0"/>
+        <w:jc w:val="left"/>
+      </w:pPr>
+      <w:r>
+        <w:rPr>
+          <w:rFonts w:ascii="Consolas" w:hAnsi="Consolas" w:eastAsia="Consolas" w:cs="Consolas"/>
+          <w:sz w:val="17"/>
+        </w:rPr>
+        <w:t xml:space="preserve">    .row { display: flex; gap: var(--s3); align-items: stretch; flex-wrap: wrap; }</w:t>
+      </w:r>
+    </w:p>
+    <w:p>
+      <w:pPr>
+        <w:keepNext w:val="0"/>
+        <w:keepLines w:val="0"/>
+        <w:pageBreakBefore w:val="0"/>
+        <w:widowControl/>
+        <w:spacing w:line="240" w:lineRule="auto" w:before="0" w:after="0"/>
+        <w:jc w:val="left"/>
+      </w:pPr>
+      <w:r>
+        <w:rPr>
+          <w:rFonts w:ascii="Consolas" w:hAnsi="Consolas" w:eastAsia="Consolas" w:cs="Consolas"/>
+          <w:sz w:val="17"/>
+        </w:rPr>
+        <w:t xml:space="preserve">    .stats { display: flex; gap: var(--s2); }</w:t>
+      </w:r>
+    </w:p>
+    <w:p>
+      <w:pPr>
+        <w:keepNext w:val="0"/>
+        <w:keepLines w:val="0"/>
+        <w:pageBreakBefore w:val="0"/>
+        <w:widowControl/>
+        <w:spacing w:line="240" w:lineRule="auto" w:before="0" w:after="0"/>
+        <w:jc w:val="left"/>
+      </w:pPr>
+      <w:r>
+        <w:rPr>
+          <w:rFonts w:ascii="Consolas" w:hAnsi="Consolas" w:eastAsia="Consolas" w:cs="Consolas"/>
+          <w:sz w:val="17"/>
+        </w:rPr>
+        <w:t xml:space="preserve">    .stats .stat { background: var(--card); padding: var(--s2) var(--s3);</w:t>
+      </w:r>
+    </w:p>
+    <w:p>
+      <w:pPr>
+        <w:keepNext w:val="0"/>
+        <w:keepLines w:val="0"/>
+        <w:pageBreakBefore w:val="0"/>
+        <w:widowControl/>
+        <w:spacing w:line="240" w:lineRule="auto" w:before="0" w:after="0"/>
+        <w:jc w:val="left"/>
+      </w:pPr>
+      <w:r>
+        <w:rPr>
+          <w:rFonts w:ascii="Consolas" w:hAnsi="Consolas" w:eastAsia="Consolas" w:cs="Consolas"/>
+          <w:sz w:val="17"/>
+        </w:rPr>
+        <w:t xml:space="preserve">      border-radius: var(--radius); font-size: 14px; color: var(--muted);</w:t>
+      </w:r>
+    </w:p>
+    <w:p>
+      <w:pPr>
+        <w:keepNext w:val="0"/>
+        <w:keepLines w:val="0"/>
+        <w:pageBreakBefore w:val="0"/>
+        <w:widowControl/>
+        <w:spacing w:line="240" w:lineRule="auto" w:before="0" w:after="0"/>
+        <w:jc w:val="left"/>
+      </w:pPr>
+      <w:r>
+        <w:rPr>
+          <w:rFonts w:ascii="Consolas" w:hAnsi="Consolas" w:eastAsia="Consolas" w:cs="Consolas"/>
+          <w:sz w:val="17"/>
+        </w:rPr>
+        <w:t xml:space="preserve">      box-shadow: var(--shadow); min-width: 96px;</w:t>
+      </w:r>
+    </w:p>
+    <w:p>
+      <w:pPr>
+        <w:keepNext w:val="0"/>
+        <w:keepLines w:val="0"/>
+        <w:pageBreakBefore w:val="0"/>
+        <w:widowControl/>
+        <w:spacing w:line="240" w:lineRule="auto" w:before="0" w:after="0"/>
+        <w:jc w:val="left"/>
+      </w:pPr>
+      <w:r>
+        <w:rPr>
+          <w:rFonts w:ascii="Consolas" w:hAnsi="Consolas" w:eastAsia="Consolas" w:cs="Consolas"/>
+          <w:sz w:val="17"/>
+        </w:rPr>
+        <w:t xml:space="preserve">      transition: transform .2s ease, box-shadow .2s ease; }</w:t>
+      </w:r>
+    </w:p>
+    <w:p>
+      <w:pPr>
+        <w:keepNext w:val="0"/>
+        <w:keepLines w:val="0"/>
+        <w:pageBreakBefore w:val="0"/>
+        <w:widowControl/>
+        <w:spacing w:line="240" w:lineRule="auto" w:before="0" w:after="0"/>
+        <w:jc w:val="left"/>
+      </w:pPr>
+      <w:r>
+        <w:rPr>
+          <w:rFonts w:ascii="Consolas" w:hAnsi="Consolas" w:eastAsia="Consolas" w:cs="Consolas"/>
+          <w:sz w:val="17"/>
+        </w:rPr>
+        <w:t xml:space="preserve">    .stats .stat:hover { transform: translateY(-2px);</w:t>
+      </w:r>
+    </w:p>
+    <w:p>
+      <w:pPr>
+        <w:keepNext w:val="0"/>
+        <w:keepLines w:val="0"/>
+        <w:pageBreakBefore w:val="0"/>
+        <w:widowControl/>
+        <w:spacing w:line="240" w:lineRule="auto" w:before="0" w:after="0"/>
+        <w:jc w:val="left"/>
+      </w:pPr>
+      <w:r>
+        <w:rPr>
+          <w:rFonts w:ascii="Consolas" w:hAnsi="Consolas" w:eastAsia="Consolas" w:cs="Consolas"/>
+          <w:sz w:val="17"/>
+        </w:rPr>
+        <w:t xml:space="preserve">      box-shadow: 0 6px 16px rgba(16,24,40,.10); }</w:t>
+      </w:r>
+    </w:p>
+    <w:p>
+      <w:pPr>
+        <w:keepNext w:val="0"/>
+        <w:keepLines w:val="0"/>
+        <w:pageBreakBefore w:val="0"/>
+        <w:widowControl/>
+        <w:spacing w:line="240" w:lineRule="auto" w:before="0" w:after="0"/>
+        <w:jc w:val="left"/>
+      </w:pPr>
+      <w:r>
+        <w:rPr>
+          <w:rFonts w:ascii="Consolas" w:hAnsi="Consolas" w:eastAsia="Consolas" w:cs="Consolas"/>
+          <w:sz w:val="17"/>
+        </w:rPr>
+        <w:t xml:space="preserve">    .stats .num { display: block; font-size: 36px; font-weight: 700; color: var(--accent);</w:t>
+      </w:r>
+    </w:p>
+    <w:p>
+      <w:pPr>
+        <w:keepNext w:val="0"/>
+        <w:keepLines w:val="0"/>
+        <w:pageBreakBefore w:val="0"/>
+        <w:widowControl/>
+        <w:spacing w:line="240" w:lineRule="auto" w:before="0" w:after="0"/>
+        <w:jc w:val="left"/>
+      </w:pPr>
+      <w:r>
+        <w:rPr>
+          <w:rFonts w:ascii="Consolas" w:hAnsi="Consolas" w:eastAsia="Consolas" w:cs="Consolas"/>
+          <w:sz w:val="17"/>
+        </w:rPr>
+        <w:t xml:space="preserve">      line-height: 1.1; transition: transform .18s ease; transform-origin: left center; }</w:t>
+      </w:r>
+    </w:p>
+    <w:p>
+      <w:pPr>
+        <w:keepNext w:val="0"/>
+        <w:keepLines w:val="0"/>
+        <w:pageBreakBefore w:val="0"/>
+        <w:widowControl/>
+        <w:spacing w:line="240" w:lineRule="auto" w:before="0" w:after="0"/>
+        <w:jc w:val="left"/>
+      </w:pPr>
+      <w:r>
+        <w:rPr>
+          <w:rFonts w:ascii="Consolas" w:hAnsi="Consolas" w:eastAsia="Consolas" w:cs="Consolas"/>
+          <w:sz w:val="17"/>
+        </w:rPr>
+        <w:t xml:space="preserve">    .num.bump { transform: scale(1.14); }</w:t>
+      </w:r>
+    </w:p>
+    <w:p>
+      <w:pPr>
+        <w:keepNext w:val="0"/>
+        <w:keepLines w:val="0"/>
+        <w:pageBreakBefore w:val="0"/>
+        <w:widowControl/>
+        <w:spacing w:line="240" w:lineRule="auto" w:before="0" w:after="0"/>
+        <w:jc w:val="left"/>
+      </w:pPr>
+      <w:r>
+        <w:rPr>
+          <w:rFonts w:ascii="Consolas" w:hAnsi="Consolas" w:eastAsia="Consolas" w:cs="Consolas"/>
+          <w:sz w:val="17"/>
+        </w:rPr>
+        <w:t xml:space="preserve">    .chart { background: var(--card); border-radius: var(--radius); padding: var(--s2);</w:t>
+      </w:r>
+    </w:p>
+    <w:p>
+      <w:pPr>
+        <w:keepNext w:val="0"/>
+        <w:keepLines w:val="0"/>
+        <w:pageBreakBefore w:val="0"/>
+        <w:widowControl/>
+        <w:spacing w:line="240" w:lineRule="auto" w:before="0" w:after="0"/>
+        <w:jc w:val="left"/>
+      </w:pPr>
+      <w:r>
+        <w:rPr>
+          <w:rFonts w:ascii="Consolas" w:hAnsi="Consolas" w:eastAsia="Consolas" w:cs="Consolas"/>
+          <w:sz w:val="17"/>
+        </w:rPr>
+        <w:t xml:space="preserve">      flex: 1 1 320px; height: 168px; box-shadow: var(--shadow); }</w:t>
+      </w:r>
+    </w:p>
+    <w:p>
+      <w:pPr>
+        <w:keepNext w:val="0"/>
+        <w:keepLines w:val="0"/>
+        <w:pageBreakBefore w:val="0"/>
+        <w:widowControl/>
+        <w:spacing w:line="240" w:lineRule="auto" w:before="0" w:after="0"/>
+        <w:jc w:val="left"/>
+      </w:pPr>
+      <w:r>
+        <w:rPr>
+          <w:rFonts w:ascii="Consolas" w:hAnsi="Consolas" w:eastAsia="Consolas" w:cs="Consolas"/>
+          <w:sz w:val="17"/>
+        </w:rPr>
+        <w:t xml:space="preserve"> </w:t>
+      </w:r>
+    </w:p>
+    <w:p>
+      <w:pPr>
+        <w:keepNext w:val="0"/>
+        <w:keepLines w:val="0"/>
+        <w:pageBreakBefore w:val="0"/>
+        <w:widowControl/>
+        <w:spacing w:line="240" w:lineRule="auto" w:before="0" w:after="0"/>
+        <w:jc w:val="left"/>
+      </w:pPr>
+      <w:r>
+        <w:rPr>
+          <w:rFonts w:ascii="Consolas" w:hAnsi="Consolas" w:eastAsia="Consolas" w:cs="Consolas"/>
+          <w:sz w:val="17"/>
+        </w:rPr>
+        <w:t xml:space="preserve">    .totals { margin: var(--s1) 0 var(--s2) 0; color: var(--muted); font-size: 14px; }</w:t>
+      </w:r>
+    </w:p>
+    <w:p>
+      <w:pPr>
+        <w:keepNext w:val="0"/>
+        <w:keepLines w:val="0"/>
+        <w:pageBreakBefore w:val="0"/>
+        <w:widowControl/>
+        <w:spacing w:line="240" w:lineRule="auto" w:before="0" w:after="0"/>
+        <w:jc w:val="left"/>
+      </w:pPr>
+      <w:r>
+        <w:rPr>
+          <w:rFonts w:ascii="Consolas" w:hAnsi="Consolas" w:eastAsia="Consolas" w:cs="Consolas"/>
+          <w:sz w:val="17"/>
+        </w:rPr>
+        <w:t xml:space="preserve">    .totals b { color: var(--ink); }</w:t>
+      </w:r>
+    </w:p>
+    <w:p>
+      <w:pPr>
+        <w:keepNext w:val="0"/>
+        <w:keepLines w:val="0"/>
+        <w:pageBreakBefore w:val="0"/>
+        <w:widowControl/>
+        <w:spacing w:line="240" w:lineRule="auto" w:before="0" w:after="0"/>
+        <w:jc w:val="left"/>
+      </w:pPr>
+      <w:r>
+        <w:rPr>
+          <w:rFonts w:ascii="Consolas" w:hAnsi="Consolas" w:eastAsia="Consolas" w:cs="Consolas"/>
+          <w:sz w:val="17"/>
+        </w:rPr>
+        <w:t xml:space="preserve">    table { width: 100%; border-collapse: collapse; background: var(--card);</w:t>
+      </w:r>
+    </w:p>
+    <w:p>
+      <w:pPr>
+        <w:keepNext w:val="0"/>
+        <w:keepLines w:val="0"/>
+        <w:pageBreakBefore w:val="0"/>
+        <w:widowControl/>
+        <w:spacing w:line="240" w:lineRule="auto" w:before="0" w:after="0"/>
+        <w:jc w:val="left"/>
+      </w:pPr>
+      <w:r>
+        <w:rPr>
+          <w:rFonts w:ascii="Consolas" w:hAnsi="Consolas" w:eastAsia="Consolas" w:cs="Consolas"/>
+          <w:sz w:val="17"/>
+        </w:rPr>
+        <w:t xml:space="preserve">      border-radius: var(--radius); overflow: hidden; box-shadow: var(--shadow); }</w:t>
+      </w:r>
+    </w:p>
+    <w:p>
+      <w:pPr>
+        <w:keepNext w:val="0"/>
+        <w:keepLines w:val="0"/>
+        <w:pageBreakBefore w:val="0"/>
+        <w:widowControl/>
+        <w:spacing w:line="240" w:lineRule="auto" w:before="0" w:after="0"/>
+        <w:jc w:val="left"/>
+      </w:pPr>
+      <w:r>
+        <w:rPr>
+          <w:rFonts w:ascii="Consolas" w:hAnsi="Consolas" w:eastAsia="Consolas" w:cs="Consolas"/>
+          <w:sz w:val="17"/>
+        </w:rPr>
+        <w:t xml:space="preserve">    th, td { text-align: left; padding: 12px var(--s2); border-bottom: 1px solid var(--line);</w:t>
+      </w:r>
+    </w:p>
+    <w:p>
+      <w:pPr>
+        <w:keepNext w:val="0"/>
+        <w:keepLines w:val="0"/>
+        <w:pageBreakBefore w:val="0"/>
+        <w:widowControl/>
+        <w:spacing w:line="240" w:lineRule="auto" w:before="0" w:after="0"/>
+        <w:jc w:val="left"/>
+      </w:pPr>
+      <w:r>
+        <w:rPr>
+          <w:rFonts w:ascii="Consolas" w:hAnsi="Consolas" w:eastAsia="Consolas" w:cs="Consolas"/>
+          <w:sz w:val="17"/>
+        </w:rPr>
+        <w:t xml:space="preserve">             font-size: 14px; }</w:t>
+      </w:r>
+    </w:p>
+    <w:p>
+      <w:pPr>
+        <w:keepNext w:val="0"/>
+        <w:keepLines w:val="0"/>
+        <w:pageBreakBefore w:val="0"/>
+        <w:widowControl/>
+        <w:spacing w:line="240" w:lineRule="auto" w:before="0" w:after="0"/>
+        <w:jc w:val="left"/>
+      </w:pPr>
+      <w:r>
+        <w:rPr>
+          <w:rFonts w:ascii="Consolas" w:hAnsi="Consolas" w:eastAsia="Consolas" w:cs="Consolas"/>
+          <w:sz w:val="17"/>
+        </w:rPr>
+        <w:t xml:space="preserve">    th { background: var(--head); font-weight: 600; color: #334155;</w:t>
+      </w:r>
+    </w:p>
+    <w:p>
+      <w:pPr>
+        <w:keepNext w:val="0"/>
+        <w:keepLines w:val="0"/>
+        <w:pageBreakBefore w:val="0"/>
+        <w:widowControl/>
+        <w:spacing w:line="240" w:lineRule="auto" w:before="0" w:after="0"/>
+        <w:jc w:val="left"/>
+      </w:pPr>
+      <w:r>
+        <w:rPr>
+          <w:rFonts w:ascii="Consolas" w:hAnsi="Consolas" w:eastAsia="Consolas" w:cs="Consolas"/>
+          <w:sz w:val="17"/>
+        </w:rPr>
+        <w:t xml:space="preserve">         text-transform: uppercase; letter-spacing: .04em; font-size: 12px; }</w:t>
+      </w:r>
+    </w:p>
+    <w:p>
+      <w:pPr>
+        <w:keepNext w:val="0"/>
+        <w:keepLines w:val="0"/>
+        <w:pageBreakBefore w:val="0"/>
+        <w:widowControl/>
+        <w:spacing w:line="240" w:lineRule="auto" w:before="0" w:after="0"/>
+        <w:jc w:val="left"/>
+      </w:pPr>
+      <w:r>
+        <w:rPr>
+          <w:rFonts w:ascii="Consolas" w:hAnsi="Consolas" w:eastAsia="Consolas" w:cs="Consolas"/>
+          <w:sz w:val="17"/>
+        </w:rPr>
+        <w:t xml:space="preserve">    tbody tr { transition: background .15s ease; }</w:t>
+      </w:r>
+    </w:p>
+    <w:p>
+      <w:pPr>
+        <w:keepNext w:val="0"/>
+        <w:keepLines w:val="0"/>
+        <w:pageBreakBefore w:val="0"/>
+        <w:widowControl/>
+        <w:spacing w:line="240" w:lineRule="auto" w:before="0" w:after="0"/>
+        <w:jc w:val="left"/>
+      </w:pPr>
+      <w:r>
+        <w:rPr>
+          <w:rFonts w:ascii="Consolas" w:hAnsi="Consolas" w:eastAsia="Consolas" w:cs="Consolas"/>
+          <w:sz w:val="17"/>
+        </w:rPr>
+        <w:t xml:space="preserve">    tbody tr:hover { background: #f8fafc; }</w:t>
+      </w:r>
+    </w:p>
+    <w:p>
+      <w:pPr>
+        <w:keepNext w:val="0"/>
+        <w:keepLines w:val="0"/>
+        <w:pageBreakBefore w:val="0"/>
+        <w:widowControl/>
+        <w:spacing w:line="240" w:lineRule="auto" w:before="0" w:after="0"/>
+        <w:jc w:val="left"/>
+      </w:pPr>
+      <w:r>
+        <w:rPr>
+          <w:rFonts w:ascii="Consolas" w:hAnsi="Consolas" w:eastAsia="Consolas" w:cs="Consolas"/>
+          <w:sz w:val="17"/>
+        </w:rPr>
+        <w:t xml:space="preserve">    tbody tr:last-child td { border-bottom: none; }</w:t>
+      </w:r>
+    </w:p>
+    <w:p>
+      <w:pPr>
+        <w:keepNext w:val="0"/>
+        <w:keepLines w:val="0"/>
+        <w:pageBreakBefore w:val="0"/>
+        <w:widowControl/>
+        <w:spacing w:line="240" w:lineRule="auto" w:before="0" w:after="0"/>
+        <w:jc w:val="left"/>
+      </w:pPr>
+      <w:r>
+        <w:rPr>
+          <w:rFonts w:ascii="Consolas" w:hAnsi="Consolas" w:eastAsia="Consolas" w:cs="Consolas"/>
+          <w:sz w:val="17"/>
+        </w:rPr>
+        <w:t xml:space="preserve">    #empty td { color: var(--muted); font-style: italic; text-align: center; padding: var(--s3); }</w:t>
+      </w:r>
+    </w:p>
+    <w:p>
+      <w:pPr>
+        <w:keepNext w:val="0"/>
+        <w:keepLines w:val="0"/>
+        <w:pageBreakBefore w:val="0"/>
+        <w:widowControl/>
+        <w:spacing w:line="240" w:lineRule="auto" w:before="0" w:after="0"/>
+        <w:jc w:val="left"/>
+      </w:pPr>
+      <w:r>
+        <w:rPr>
+          <w:rFonts w:ascii="Consolas" w:hAnsi="Consolas" w:eastAsia="Consolas" w:cs="Consolas"/>
+          <w:sz w:val="17"/>
+        </w:rPr>
+        <w:t xml:space="preserve"> </w:t>
+      </w:r>
+    </w:p>
+    <w:p>
+      <w:pPr>
+        <w:keepNext w:val="0"/>
+        <w:keepLines w:val="0"/>
+        <w:pageBreakBefore w:val="0"/>
+        <w:widowControl/>
+        <w:spacing w:line="240" w:lineRule="auto" w:before="0" w:after="0"/>
+        <w:jc w:val="left"/>
+      </w:pPr>
+      <w:r>
+        <w:rPr>
+          <w:rFonts w:ascii="Consolas" w:hAnsi="Consolas" w:eastAsia="Consolas" w:cs="Consolas"/>
+          <w:sz w:val="17"/>
+        </w:rPr>
+        <w:t xml:space="preserve">    .pill { display: inline-block; color: #fff; font-weight: 700; text-transform: capitalize;</w:t>
+      </w:r>
+    </w:p>
+    <w:p>
+      <w:pPr>
+        <w:keepNext w:val="0"/>
+        <w:keepLines w:val="0"/>
+        <w:pageBreakBefore w:val="0"/>
+        <w:widowControl/>
+        <w:spacing w:line="240" w:lineRule="auto" w:before="0" w:after="0"/>
+        <w:jc w:val="left"/>
+      </w:pPr>
+      <w:r>
+        <w:rPr>
+          <w:rFonts w:ascii="Consolas" w:hAnsi="Consolas" w:eastAsia="Consolas" w:cs="Consolas"/>
+          <w:sz w:val="17"/>
+        </w:rPr>
+        <w:t xml:space="preserve">      padding: 3px 12px; border-radius: 999px; font-size: 13px; }</w:t>
+      </w:r>
+    </w:p>
+    <w:p>
+      <w:pPr>
+        <w:keepNext w:val="0"/>
+        <w:keepLines w:val="0"/>
+        <w:pageBreakBefore w:val="0"/>
+        <w:widowControl/>
+        <w:spacing w:line="240" w:lineRule="auto" w:before="0" w:after="0"/>
+        <w:jc w:val="left"/>
+      </w:pPr>
+      <w:r>
+        <w:rPr>
+          <w:rFonts w:ascii="Consolas" w:hAnsi="Consolas" w:eastAsia="Consolas" w:cs="Consolas"/>
+          <w:sz w:val="17"/>
+        </w:rPr>
+        <w:t xml:space="preserve">    .pill.medium { background: var(--medium); } .pill.high { background: var(--high); }</w:t>
+      </w:r>
+    </w:p>
+    <w:p>
+      <w:pPr>
+        <w:keepNext w:val="0"/>
+        <w:keepLines w:val="0"/>
+        <w:pageBreakBefore w:val="0"/>
+        <w:widowControl/>
+        <w:spacing w:line="240" w:lineRule="auto" w:before="0" w:after="0"/>
+        <w:jc w:val="left"/>
+      </w:pPr>
+      <w:r>
+        <w:rPr>
+          <w:rFonts w:ascii="Consolas" w:hAnsi="Consolas" w:eastAsia="Consolas" w:cs="Consolas"/>
+          <w:sz w:val="17"/>
+        </w:rPr>
+        <w:t xml:space="preserve">    .pill.critical { background: var(--critical); }</w:t>
+      </w:r>
+    </w:p>
+    <w:p>
+      <w:pPr>
+        <w:keepNext w:val="0"/>
+        <w:keepLines w:val="0"/>
+        <w:pageBreakBefore w:val="0"/>
+        <w:widowControl/>
+        <w:spacing w:line="240" w:lineRule="auto" w:before="0" w:after="0"/>
+        <w:jc w:val="left"/>
+      </w:pPr>
+      <w:r>
+        <w:rPr>
+          <w:rFonts w:ascii="Consolas" w:hAnsi="Consolas" w:eastAsia="Consolas" w:cs="Consolas"/>
+          <w:sz w:val="17"/>
+        </w:rPr>
+        <w:t xml:space="preserve"> </w:t>
+      </w:r>
+    </w:p>
+    <w:p>
+      <w:pPr>
+        <w:keepNext w:val="0"/>
+        <w:keepLines w:val="0"/>
+        <w:pageBreakBefore w:val="0"/>
+        <w:widowControl/>
+        <w:spacing w:line="240" w:lineRule="auto" w:before="0" w:after="0"/>
+        <w:jc w:val="left"/>
+      </w:pPr>
+      <w:r>
+        <w:rPr>
+          <w:rFonts w:ascii="Consolas" w:hAnsi="Consolas" w:eastAsia="Consolas" w:cs="Consolas"/>
+          <w:sz w:val="17"/>
+        </w:rPr>
+        <w:t xml:space="preserve">    /* new alert row reveals and briefly highlights */</w:t>
+      </w:r>
+    </w:p>
+    <w:p>
+      <w:pPr>
+        <w:keepNext w:val="0"/>
+        <w:keepLines w:val="0"/>
+        <w:pageBreakBefore w:val="0"/>
+        <w:widowControl/>
+        <w:spacing w:line="240" w:lineRule="auto" w:before="0" w:after="0"/>
+        <w:jc w:val="left"/>
+      </w:pPr>
+      <w:r>
+        <w:rPr>
+          <w:rFonts w:ascii="Consolas" w:hAnsi="Consolas" w:eastAsia="Consolas" w:cs="Consolas"/>
+          <w:sz w:val="17"/>
+        </w:rPr>
+        <w:t xml:space="preserve">    tr.new { animation: fadeInUp .35s ease both; }</w:t>
+      </w:r>
+    </w:p>
+    <w:p>
+      <w:pPr>
+        <w:keepNext w:val="0"/>
+        <w:keepLines w:val="0"/>
+        <w:pageBreakBefore w:val="0"/>
+        <w:widowControl/>
+        <w:spacing w:line="240" w:lineRule="auto" w:before="0" w:after="0"/>
+        <w:jc w:val="left"/>
+      </w:pPr>
+      <w:r>
+        <w:rPr>
+          <w:rFonts w:ascii="Consolas" w:hAnsi="Consolas" w:eastAsia="Consolas" w:cs="Consolas"/>
+          <w:sz w:val="17"/>
+        </w:rPr>
+        <w:t xml:space="preserve">    tr.flash { animation: flash 1.2s ease; }</w:t>
+      </w:r>
+    </w:p>
+    <w:p>
+      <w:pPr>
+        <w:keepNext w:val="0"/>
+        <w:keepLines w:val="0"/>
+        <w:pageBreakBefore w:val="0"/>
+        <w:widowControl/>
+        <w:spacing w:line="240" w:lineRule="auto" w:before="0" w:after="0"/>
+        <w:jc w:val="left"/>
+      </w:pPr>
+      <w:r>
+        <w:rPr>
+          <w:rFonts w:ascii="Consolas" w:hAnsi="Consolas" w:eastAsia="Consolas" w:cs="Consolas"/>
+          <w:sz w:val="17"/>
+        </w:rPr>
+        <w:t xml:space="preserve">    tr.flash .pill { animation: pop .4s ease; }</w:t>
+      </w:r>
+    </w:p>
+    <w:p>
+      <w:pPr>
+        <w:keepNext w:val="0"/>
+        <w:keepLines w:val="0"/>
+        <w:pageBreakBefore w:val="0"/>
+        <w:widowControl/>
+        <w:spacing w:line="240" w:lineRule="auto" w:before="0" w:after="0"/>
+        <w:jc w:val="left"/>
+      </w:pPr>
+      <w:r>
+        <w:rPr>
+          <w:rFonts w:ascii="Consolas" w:hAnsi="Consolas" w:eastAsia="Consolas" w:cs="Consolas"/>
+          <w:sz w:val="17"/>
+        </w:rPr>
+        <w:t xml:space="preserve"> </w:t>
+      </w:r>
+    </w:p>
+    <w:p>
+      <w:pPr>
+        <w:keepNext w:val="0"/>
+        <w:keepLines w:val="0"/>
+        <w:pageBreakBefore w:val="0"/>
+        <w:widowControl/>
+        <w:spacing w:line="240" w:lineRule="auto" w:before="0" w:after="0"/>
+        <w:jc w:val="left"/>
+      </w:pPr>
+      <w:r>
+        <w:rPr>
+          <w:rFonts w:ascii="Consolas" w:hAnsi="Consolas" w:eastAsia="Consolas" w:cs="Consolas"/>
+          <w:sz w:val="17"/>
+        </w:rPr>
+        <w:t xml:space="preserve">    @keyframes spin { to { transform: rotate(360deg); } }</w:t>
+      </w:r>
+    </w:p>
+    <w:p>
+      <w:pPr>
+        <w:keepNext w:val="0"/>
+        <w:keepLines w:val="0"/>
+        <w:pageBreakBefore w:val="0"/>
+        <w:widowControl/>
+        <w:spacing w:line="240" w:lineRule="auto" w:before="0" w:after="0"/>
+        <w:jc w:val="left"/>
+      </w:pPr>
+      <w:r>
+        <w:rPr>
+          <w:rFonts w:ascii="Consolas" w:hAnsi="Consolas" w:eastAsia="Consolas" w:cs="Consolas"/>
+          <w:sz w:val="17"/>
+        </w:rPr>
+        <w:t xml:space="preserve">    @keyframes pulse { 0%,100% { box-shadow: 0 0 0 0 rgba(27,127,115,.45); }</w:t>
+      </w:r>
+    </w:p>
+    <w:p>
+      <w:pPr>
+        <w:keepNext w:val="0"/>
+        <w:keepLines w:val="0"/>
+        <w:pageBreakBefore w:val="0"/>
+        <w:widowControl/>
+        <w:spacing w:line="240" w:lineRule="auto" w:before="0" w:after="0"/>
+        <w:jc w:val="left"/>
+      </w:pPr>
+      <w:r>
+        <w:rPr>
+          <w:rFonts w:ascii="Consolas" w:hAnsi="Consolas" w:eastAsia="Consolas" w:cs="Consolas"/>
+          <w:sz w:val="17"/>
+        </w:rPr>
+        <w:t xml:space="preserve">                       50% { box-shadow: 0 0 0 5px rgba(27,127,115,0); } }</w:t>
+      </w:r>
+    </w:p>
+    <w:p>
+      <w:pPr>
+        <w:keepNext w:val="0"/>
+        <w:keepLines w:val="0"/>
+        <w:pageBreakBefore w:val="0"/>
+        <w:widowControl/>
+        <w:spacing w:line="240" w:lineRule="auto" w:before="0" w:after="0"/>
+        <w:jc w:val="left"/>
+      </w:pPr>
+      <w:r>
+        <w:rPr>
+          <w:rFonts w:ascii="Consolas" w:hAnsi="Consolas" w:eastAsia="Consolas" w:cs="Consolas"/>
+          <w:sz w:val="17"/>
+        </w:rPr>
+        <w:t xml:space="preserve">    @keyframes fadeInUp { from { opacity: 0; transform: translateY(-8px); } to { opacity: 1; transform: none; } }</w:t>
+      </w:r>
+    </w:p>
+    <w:p>
+      <w:pPr>
+        <w:keepNext w:val="0"/>
+        <w:keepLines w:val="0"/>
+        <w:pageBreakBefore w:val="0"/>
+        <w:widowControl/>
+        <w:spacing w:line="240" w:lineRule="auto" w:before="0" w:after="0"/>
+        <w:jc w:val="left"/>
+      </w:pPr>
+      <w:r>
+        <w:rPr>
+          <w:rFonts w:ascii="Consolas" w:hAnsi="Consolas" w:eastAsia="Consolas" w:cs="Consolas"/>
+          <w:sz w:val="17"/>
+        </w:rPr>
+        <w:t xml:space="preserve">    @keyframes flash { 0% { background: #fff4d6; } 100% { background: transparent; } }</w:t>
+      </w:r>
+    </w:p>
+    <w:p>
+      <w:pPr>
+        <w:keepNext w:val="0"/>
+        <w:keepLines w:val="0"/>
+        <w:pageBreakBefore w:val="0"/>
+        <w:widowControl/>
+        <w:spacing w:line="240" w:lineRule="auto" w:before="0" w:after="0"/>
+        <w:jc w:val="left"/>
+      </w:pPr>
+      <w:r>
+        <w:rPr>
+          <w:rFonts w:ascii="Consolas" w:hAnsi="Consolas" w:eastAsia="Consolas" w:cs="Consolas"/>
+          <w:sz w:val="17"/>
+        </w:rPr>
+        <w:t xml:space="preserve">    @keyframes pop { 0% { transform: scale(.8); } 60% { transform: scale(1.12); } 100% { transform: scale(1); } }</w:t>
+      </w:r>
+    </w:p>
+    <w:p>
+      <w:pPr>
+        <w:keepNext w:val="0"/>
+        <w:keepLines w:val="0"/>
+        <w:pageBreakBefore w:val="0"/>
+        <w:widowControl/>
+        <w:spacing w:line="240" w:lineRule="auto" w:before="0" w:after="0"/>
+        <w:jc w:val="left"/>
+      </w:pPr>
+      <w:r>
+        <w:rPr>
+          <w:rFonts w:ascii="Consolas" w:hAnsi="Consolas" w:eastAsia="Consolas" w:cs="Consolas"/>
+          <w:sz w:val="17"/>
+        </w:rPr>
+        <w:t xml:space="preserve"> </w:t>
+      </w:r>
+    </w:p>
+    <w:p>
+      <w:pPr>
+        <w:keepNext w:val="0"/>
+        <w:keepLines w:val="0"/>
+        <w:pageBreakBefore w:val="0"/>
+        <w:widowControl/>
+        <w:spacing w:line="240" w:lineRule="auto" w:before="0" w:after="0"/>
+        <w:jc w:val="left"/>
+      </w:pPr>
+      <w:r>
+        <w:rPr>
+          <w:rFonts w:ascii="Consolas" w:hAnsi="Consolas" w:eastAsia="Consolas" w:cs="Consolas"/>
+          <w:sz w:val="17"/>
+        </w:rPr>
+        <w:t xml:space="preserve">    @media (prefers-reduced-motion: reduce) {</w:t>
+      </w:r>
+    </w:p>
+    <w:p>
+      <w:pPr>
+        <w:keepNext w:val="0"/>
+        <w:keepLines w:val="0"/>
+        <w:pageBreakBefore w:val="0"/>
+        <w:widowControl/>
+        <w:spacing w:line="240" w:lineRule="auto" w:before="0" w:after="0"/>
+        <w:jc w:val="left"/>
+      </w:pPr>
+      <w:r>
+        <w:rPr>
+          <w:rFonts w:ascii="Consolas" w:hAnsi="Consolas" w:eastAsia="Consolas" w:cs="Consolas"/>
+          <w:sz w:val="17"/>
+        </w:rPr>
+        <w:t xml:space="preserve">      * { animation: none !important; transition: none !important; }</w:t>
+      </w:r>
+    </w:p>
+    <w:p>
+      <w:pPr>
+        <w:keepNext w:val="0"/>
+        <w:keepLines w:val="0"/>
+        <w:pageBreakBefore w:val="0"/>
+        <w:widowControl/>
+        <w:spacing w:line="240" w:lineRule="auto" w:before="0" w:after="0"/>
+        <w:jc w:val="left"/>
+      </w:pPr>
+      <w:r>
+        <w:rPr>
+          <w:rFonts w:ascii="Consolas" w:hAnsi="Consolas" w:eastAsia="Consolas" w:cs="Consolas"/>
+          <w:sz w:val="17"/>
+        </w:rPr>
+        <w:t xml:space="preserve">    }</w:t>
       </w:r>
     </w:p>
     <w:p>
@@ -23870,24 +25094,58 @@
           <w:rFonts w:ascii="Consolas" w:hAnsi="Consolas" w:eastAsia="Consolas" w:cs="Consolas"/>
           <w:sz w:val="17"/>
         </w:rPr>
-        <w:t xml:space="preserve">  &lt;div id="status"&gt;Connecting to server...&lt;/div&gt;</w:t>
-      </w:r>
-    </w:p>
-    <w:p>
-      <w:pPr>
-        <w:keepNext w:val="0"/>
-        <w:keepLines w:val="0"/>
-        <w:pageBreakBefore w:val="0"/>
-        <w:widowControl/>
-        <w:spacing w:line="240" w:lineRule="auto" w:before="0" w:after="0"/>
-        <w:jc w:val="left"/>
-      </w:pPr>
-      <w:r>
-        <w:rPr>
-          <w:rFonts w:ascii="Consolas" w:hAnsi="Consolas" w:eastAsia="Consolas" w:cs="Consolas"/>
-          <w:sz w:val="17"/>
-        </w:rPr>
-        <w:t xml:space="preserve">  &lt;div id="banner" hidden&gt;&lt;/div&gt;</w:t>
+        <w:t xml:space="preserve">  &lt;div id="status" class="connecting" role="status" aria-live="polite"&gt;</w:t>
+      </w:r>
+    </w:p>
+    <w:p>
+      <w:pPr>
+        <w:keepNext w:val="0"/>
+        <w:keepLines w:val="0"/>
+        <w:pageBreakBefore w:val="0"/>
+        <w:widowControl/>
+        <w:spacing w:line="240" w:lineRule="auto" w:before="0" w:after="0"/>
+        <w:jc w:val="left"/>
+      </w:pPr>
+      <w:r>
+        <w:rPr>
+          <w:rFonts w:ascii="Consolas" w:hAnsi="Consolas" w:eastAsia="Consolas" w:cs="Consolas"/>
+          <w:sz w:val="17"/>
+        </w:rPr>
+        <w:t xml:space="preserve">    &lt;span class="dot"&gt;&lt;/span&gt;&lt;span id="status-text"&gt;Connecting to server...&lt;/span&gt;</w:t>
+      </w:r>
+    </w:p>
+    <w:p>
+      <w:pPr>
+        <w:keepNext w:val="0"/>
+        <w:keepLines w:val="0"/>
+        <w:pageBreakBefore w:val="0"/>
+        <w:widowControl/>
+        <w:spacing w:line="240" w:lineRule="auto" w:before="0" w:after="0"/>
+        <w:jc w:val="left"/>
+      </w:pPr>
+      <w:r>
+        <w:rPr>
+          <w:rFonts w:ascii="Consolas" w:hAnsi="Consolas" w:eastAsia="Consolas" w:cs="Consolas"/>
+          <w:sz w:val="17"/>
+        </w:rPr>
+        <w:t xml:space="preserve">  &lt;/div&gt;</w:t>
+      </w:r>
+    </w:p>
+    <w:p>
+      <w:pPr>
+        <w:keepNext w:val="0"/>
+        <w:keepLines w:val="0"/>
+        <w:pageBreakBefore w:val="0"/>
+        <w:widowControl/>
+        <w:spacing w:line="240" w:lineRule="auto" w:before="0" w:after="0"/>
+        <w:jc w:val="left"/>
+      </w:pPr>
+      <w:r>
+        <w:rPr>
+          <w:rFonts w:ascii="Consolas" w:hAnsi="Consolas" w:eastAsia="Consolas" w:cs="Consolas"/>
+          <w:sz w:val="17"/>
+        </w:rPr>
+        <w:t xml:space="preserve">  &lt;div id="banner" role="alert" aria-live="assertive"&gt;&lt;/div&gt;</w:t>
       </w:r>
     </w:p>
     <w:p>
@@ -23972,41 +25230,41 @@
           <w:rFonts w:ascii="Consolas" w:hAnsi="Consolas" w:eastAsia="Consolas" w:cs="Consolas"/>
           <w:sz w:val="17"/>
         </w:rPr>
-        <w:t xml:space="preserve">      &lt;div&gt;TCP &lt;span id="TCP"&gt;0&lt;/span&gt;&lt;/div&gt;</w:t>
-      </w:r>
-    </w:p>
-    <w:p>
-      <w:pPr>
-        <w:keepNext w:val="0"/>
-        <w:keepLines w:val="0"/>
-        <w:pageBreakBefore w:val="0"/>
-        <w:widowControl/>
-        <w:spacing w:line="240" w:lineRule="auto" w:before="0" w:after="0"/>
-        <w:jc w:val="left"/>
-      </w:pPr>
-      <w:r>
-        <w:rPr>
-          <w:rFonts w:ascii="Consolas" w:hAnsi="Consolas" w:eastAsia="Consolas" w:cs="Consolas"/>
-          <w:sz w:val="17"/>
-        </w:rPr>
-        <w:t xml:space="preserve">      &lt;div&gt;UDP &lt;span id="UDP"&gt;0&lt;/span&gt;&lt;/div&gt;</w:t>
-      </w:r>
-    </w:p>
-    <w:p>
-      <w:pPr>
-        <w:keepNext w:val="0"/>
-        <w:keepLines w:val="0"/>
-        <w:pageBreakBefore w:val="0"/>
-        <w:widowControl/>
-        <w:spacing w:line="240" w:lineRule="auto" w:before="0" w:after="0"/>
-        <w:jc w:val="left"/>
-      </w:pPr>
-      <w:r>
-        <w:rPr>
-          <w:rFonts w:ascii="Consolas" w:hAnsi="Consolas" w:eastAsia="Consolas" w:cs="Consolas"/>
-          <w:sz w:val="17"/>
-        </w:rPr>
-        <w:t xml:space="preserve">      &lt;div&gt;ARP &lt;span id="ARP"&gt;0&lt;/span&gt;&lt;/div&gt;</w:t>
+        <w:t xml:space="preserve">      &lt;div class="stat"&gt;TCP &lt;span class="num" id="TCP"&gt;0&lt;/span&gt;&lt;/div&gt;</w:t>
+      </w:r>
+    </w:p>
+    <w:p>
+      <w:pPr>
+        <w:keepNext w:val="0"/>
+        <w:keepLines w:val="0"/>
+        <w:pageBreakBefore w:val="0"/>
+        <w:widowControl/>
+        <w:spacing w:line="240" w:lineRule="auto" w:before="0" w:after="0"/>
+        <w:jc w:val="left"/>
+      </w:pPr>
+      <w:r>
+        <w:rPr>
+          <w:rFonts w:ascii="Consolas" w:hAnsi="Consolas" w:eastAsia="Consolas" w:cs="Consolas"/>
+          <w:sz w:val="17"/>
+        </w:rPr>
+        <w:t xml:space="preserve">      &lt;div class="stat"&gt;UDP &lt;span class="num" id="UDP"&gt;0&lt;/span&gt;&lt;/div&gt;</w:t>
+      </w:r>
+    </w:p>
+    <w:p>
+      <w:pPr>
+        <w:keepNext w:val="0"/>
+        <w:keepLines w:val="0"/>
+        <w:pageBreakBefore w:val="0"/>
+        <w:widowControl/>
+        <w:spacing w:line="240" w:lineRule="auto" w:before="0" w:after="0"/>
+        <w:jc w:val="left"/>
+      </w:pPr>
+      <w:r>
+        <w:rPr>
+          <w:rFonts w:ascii="Consolas" w:hAnsi="Consolas" w:eastAsia="Consolas" w:cs="Consolas"/>
+          <w:sz w:val="17"/>
+        </w:rPr>
+        <w:t xml:space="preserve">      &lt;div class="stat"&gt;ARP &lt;span class="num" id="ARP"&gt;0&lt;/span&gt;&lt;/div&gt;</w:t>
       </w:r>
     </w:p>
     <w:p>
@@ -24159,7 +25417,41 @@
           <w:rFonts w:ascii="Consolas" w:hAnsi="Consolas" w:eastAsia="Consolas" w:cs="Consolas"/>
           <w:sz w:val="17"/>
         </w:rPr>
-        <w:t xml:space="preserve">    &lt;tbody id="alerts"&gt;&lt;/tbody&gt;</w:t>
+        <w:t xml:space="preserve">    &lt;tbody id="alerts"&gt;</w:t>
+      </w:r>
+    </w:p>
+    <w:p>
+      <w:pPr>
+        <w:keepNext w:val="0"/>
+        <w:keepLines w:val="0"/>
+        <w:pageBreakBefore w:val="0"/>
+        <w:widowControl/>
+        <w:spacing w:line="240" w:lineRule="auto" w:before="0" w:after="0"/>
+        <w:jc w:val="left"/>
+      </w:pPr>
+      <w:r>
+        <w:rPr>
+          <w:rFonts w:ascii="Consolas" w:hAnsi="Consolas" w:eastAsia="Consolas" w:cs="Consolas"/>
+          <w:sz w:val="17"/>
+        </w:rPr>
+        <w:t xml:space="preserve">      &lt;tr id="empty"&gt;&lt;td colspan="7"&gt;No alerts yet. The system is watching live traffic.&lt;/td&gt;&lt;/tr&gt;</w:t>
+      </w:r>
+    </w:p>
+    <w:p>
+      <w:pPr>
+        <w:keepNext w:val="0"/>
+        <w:keepLines w:val="0"/>
+        <w:pageBreakBefore w:val="0"/>
+        <w:widowControl/>
+        <w:spacing w:line="240" w:lineRule="auto" w:before="0" w:after="0"/>
+        <w:jc w:val="left"/>
+      </w:pPr>
+      <w:r>
+        <w:rPr>
+          <w:rFonts w:ascii="Consolas" w:hAnsi="Consolas" w:eastAsia="Consolas" w:cs="Consolas"/>
+          <w:sz w:val="17"/>
+        </w:rPr>
+        <w:t xml:space="preserve">    &lt;/tbody&gt;</w:t>
       </w:r>
     </w:p>
     <w:p>
@@ -24278,41 +25570,160 @@
           <w:rFonts w:ascii="Consolas" w:hAnsi="Consolas" w:eastAsia="Consolas" w:cs="Consolas"/>
           <w:sz w:val="17"/>
         </w:rPr>
-        <w:t xml:space="preserve">    const status = document.getElementById("status");</w:t>
-      </w:r>
-    </w:p>
-    <w:p>
-      <w:pPr>
-        <w:keepNext w:val="0"/>
-        <w:keepLines w:val="0"/>
-        <w:pageBreakBefore w:val="0"/>
-        <w:widowControl/>
-        <w:spacing w:line="240" w:lineRule="auto" w:before="0" w:after="0"/>
-        <w:jc w:val="left"/>
-      </w:pPr>
-      <w:r>
-        <w:rPr>
-          <w:rFonts w:ascii="Consolas" w:hAnsi="Consolas" w:eastAsia="Consolas" w:cs="Consolas"/>
-          <w:sz w:val="17"/>
-        </w:rPr>
-        <w:t xml:space="preserve">    socket.on("connect", () =&gt; { status.textContent = "Connected to server, waiting for sensor data"; status.className = "on"; });</w:t>
-      </w:r>
-    </w:p>
-    <w:p>
-      <w:pPr>
-        <w:keepNext w:val="0"/>
-        <w:keepLines w:val="0"/>
-        <w:pageBreakBefore w:val="0"/>
-        <w:widowControl/>
-        <w:spacing w:line="240" w:lineRule="auto" w:before="0" w:after="0"/>
-        <w:jc w:val="left"/>
-      </w:pPr>
-      <w:r>
-        <w:rPr>
-          <w:rFonts w:ascii="Consolas" w:hAnsi="Consolas" w:eastAsia="Consolas" w:cs="Consolas"/>
-          <w:sz w:val="17"/>
-        </w:rPr>
-        <w:t xml:space="preserve">    socket.on("disconnect", () =&gt; { status.textContent = "Server connection lost"; status.className = ""; });</w:t>
+        <w:t xml:space="preserve">    const statusEl = document.getElementById("status");</w:t>
+      </w:r>
+    </w:p>
+    <w:p>
+      <w:pPr>
+        <w:keepNext w:val="0"/>
+        <w:keepLines w:val="0"/>
+        <w:pageBreakBefore w:val="0"/>
+        <w:widowControl/>
+        <w:spacing w:line="240" w:lineRule="auto" w:before="0" w:after="0"/>
+        <w:jc w:val="left"/>
+      </w:pPr>
+      <w:r>
+        <w:rPr>
+          <w:rFonts w:ascii="Consolas" w:hAnsi="Consolas" w:eastAsia="Consolas" w:cs="Consolas"/>
+          <w:sz w:val="17"/>
+        </w:rPr>
+        <w:t xml:space="preserve">    const statusText = document.getElementById("status-text");</w:t>
+      </w:r>
+    </w:p>
+    <w:p>
+      <w:pPr>
+        <w:keepNext w:val="0"/>
+        <w:keepLines w:val="0"/>
+        <w:pageBreakBefore w:val="0"/>
+        <w:widowControl/>
+        <w:spacing w:line="240" w:lineRule="auto" w:before="0" w:after="0"/>
+        <w:jc w:val="left"/>
+      </w:pPr>
+      <w:r>
+        <w:rPr>
+          <w:rFonts w:ascii="Consolas" w:hAnsi="Consolas" w:eastAsia="Consolas" w:cs="Consolas"/>
+          <w:sz w:val="17"/>
+        </w:rPr>
+        <w:t xml:space="preserve">    socket.on("connect", () =&gt; {</w:t>
+      </w:r>
+    </w:p>
+    <w:p>
+      <w:pPr>
+        <w:keepNext w:val="0"/>
+        <w:keepLines w:val="0"/>
+        <w:pageBreakBefore w:val="0"/>
+        <w:widowControl/>
+        <w:spacing w:line="240" w:lineRule="auto" w:before="0" w:after="0"/>
+        <w:jc w:val="left"/>
+      </w:pPr>
+      <w:r>
+        <w:rPr>
+          <w:rFonts w:ascii="Consolas" w:hAnsi="Consolas" w:eastAsia="Consolas" w:cs="Consolas"/>
+          <w:sz w:val="17"/>
+        </w:rPr>
+        <w:t xml:space="preserve">      statusText.textContent = "Connected to server, waiting for sensor data";</w:t>
+      </w:r>
+    </w:p>
+    <w:p>
+      <w:pPr>
+        <w:keepNext w:val="0"/>
+        <w:keepLines w:val="0"/>
+        <w:pageBreakBefore w:val="0"/>
+        <w:widowControl/>
+        <w:spacing w:line="240" w:lineRule="auto" w:before="0" w:after="0"/>
+        <w:jc w:val="left"/>
+      </w:pPr>
+      <w:r>
+        <w:rPr>
+          <w:rFonts w:ascii="Consolas" w:hAnsi="Consolas" w:eastAsia="Consolas" w:cs="Consolas"/>
+          <w:sz w:val="17"/>
+        </w:rPr>
+        <w:t xml:space="preserve">      statusEl.className = "on";</w:t>
+      </w:r>
+    </w:p>
+    <w:p>
+      <w:pPr>
+        <w:keepNext w:val="0"/>
+        <w:keepLines w:val="0"/>
+        <w:pageBreakBefore w:val="0"/>
+        <w:widowControl/>
+        <w:spacing w:line="240" w:lineRule="auto" w:before="0" w:after="0"/>
+        <w:jc w:val="left"/>
+      </w:pPr>
+      <w:r>
+        <w:rPr>
+          <w:rFonts w:ascii="Consolas" w:hAnsi="Consolas" w:eastAsia="Consolas" w:cs="Consolas"/>
+          <w:sz w:val="17"/>
+        </w:rPr>
+        <w:t xml:space="preserve">    });</w:t>
+      </w:r>
+    </w:p>
+    <w:p>
+      <w:pPr>
+        <w:keepNext w:val="0"/>
+        <w:keepLines w:val="0"/>
+        <w:pageBreakBefore w:val="0"/>
+        <w:widowControl/>
+        <w:spacing w:line="240" w:lineRule="auto" w:before="0" w:after="0"/>
+        <w:jc w:val="left"/>
+      </w:pPr>
+      <w:r>
+        <w:rPr>
+          <w:rFonts w:ascii="Consolas" w:hAnsi="Consolas" w:eastAsia="Consolas" w:cs="Consolas"/>
+          <w:sz w:val="17"/>
+        </w:rPr>
+        <w:t xml:space="preserve">    socket.on("disconnect", () =&gt; {</w:t>
+      </w:r>
+    </w:p>
+    <w:p>
+      <w:pPr>
+        <w:keepNext w:val="0"/>
+        <w:keepLines w:val="0"/>
+        <w:pageBreakBefore w:val="0"/>
+        <w:widowControl/>
+        <w:spacing w:line="240" w:lineRule="auto" w:before="0" w:after="0"/>
+        <w:jc w:val="left"/>
+      </w:pPr>
+      <w:r>
+        <w:rPr>
+          <w:rFonts w:ascii="Consolas" w:hAnsi="Consolas" w:eastAsia="Consolas" w:cs="Consolas"/>
+          <w:sz w:val="17"/>
+        </w:rPr>
+        <w:t xml:space="preserve">      statusText.textContent = "Server connection lost, reconnecting...";</w:t>
+      </w:r>
+    </w:p>
+    <w:p>
+      <w:pPr>
+        <w:keepNext w:val="0"/>
+        <w:keepLines w:val="0"/>
+        <w:pageBreakBefore w:val="0"/>
+        <w:widowControl/>
+        <w:spacing w:line="240" w:lineRule="auto" w:before="0" w:after="0"/>
+        <w:jc w:val="left"/>
+      </w:pPr>
+      <w:r>
+        <w:rPr>
+          <w:rFonts w:ascii="Consolas" w:hAnsi="Consolas" w:eastAsia="Consolas" w:cs="Consolas"/>
+          <w:sz w:val="17"/>
+        </w:rPr>
+        <w:t xml:space="preserve">      statusEl.className = "off";</w:t>
+      </w:r>
+    </w:p>
+    <w:p>
+      <w:pPr>
+        <w:keepNext w:val="0"/>
+        <w:keepLines w:val="0"/>
+        <w:pageBreakBefore w:val="0"/>
+        <w:widowControl/>
+        <w:spacing w:line="240" w:lineRule="auto" w:before="0" w:after="0"/>
+        <w:jc w:val="left"/>
+      </w:pPr>
+      <w:r>
+        <w:rPr>
+          <w:rFonts w:ascii="Consolas" w:hAnsi="Consolas" w:eastAsia="Consolas" w:cs="Consolas"/>
+          <w:sz w:val="17"/>
+        </w:rPr>
+        <w:t xml:space="preserve">    });</w:t>
       </w:r>
     </w:p>
     <w:p>
@@ -24380,24 +25791,75 @@
           <w:rFonts w:ascii="Consolas" w:hAnsi="Consolas" w:eastAsia="Consolas" w:cs="Consolas"/>
           <w:sz w:val="17"/>
         </w:rPr>
-        <w:t xml:space="preserve">      data: { labels: [], datasets: [{ label: "packets per second", data: [], borderColor: "#1f4e79", tension: 0.3, pointRadius: 0 }] },</w:t>
-      </w:r>
-    </w:p>
-    <w:p>
-      <w:pPr>
-        <w:keepNext w:val="0"/>
-        <w:keepLines w:val="0"/>
-        <w:pageBreakBefore w:val="0"/>
-        <w:widowControl/>
-        <w:spacing w:line="240" w:lineRule="auto" w:before="0" w:after="0"/>
-        <w:jc w:val="left"/>
-      </w:pPr>
-      <w:r>
-        <w:rPr>
-          <w:rFonts w:ascii="Consolas" w:hAnsi="Consolas" w:eastAsia="Consolas" w:cs="Consolas"/>
-          <w:sz w:val="17"/>
-        </w:rPr>
-        <w:t xml:space="preserve">      options: { animation: false, maintainAspectRatio: false, scales: { y: { beginAtZero: true } }, plugins: { legend: { display: false } } }</w:t>
+        <w:t xml:space="preserve">      data: { labels: [], datasets: [{ label: "packets per second", data: [],</w:t>
+      </w:r>
+    </w:p>
+    <w:p>
+      <w:pPr>
+        <w:keepNext w:val="0"/>
+        <w:keepLines w:val="0"/>
+        <w:pageBreakBefore w:val="0"/>
+        <w:widowControl/>
+        <w:spacing w:line="240" w:lineRule="auto" w:before="0" w:after="0"/>
+        <w:jc w:val="left"/>
+      </w:pPr>
+      <w:r>
+        <w:rPr>
+          <w:rFonts w:ascii="Consolas" w:hAnsi="Consolas" w:eastAsia="Consolas" w:cs="Consolas"/>
+          <w:sz w:val="17"/>
+        </w:rPr>
+        <w:t xml:space="preserve">        borderColor: "#1f4e79", backgroundColor: "rgba(31,78,121,.08)", fill: true,</w:t>
+      </w:r>
+    </w:p>
+    <w:p>
+      <w:pPr>
+        <w:keepNext w:val="0"/>
+        <w:keepLines w:val="0"/>
+        <w:pageBreakBefore w:val="0"/>
+        <w:widowControl/>
+        <w:spacing w:line="240" w:lineRule="auto" w:before="0" w:after="0"/>
+        <w:jc w:val="left"/>
+      </w:pPr>
+      <w:r>
+        <w:rPr>
+          <w:rFonts w:ascii="Consolas" w:hAnsi="Consolas" w:eastAsia="Consolas" w:cs="Consolas"/>
+          <w:sz w:val="17"/>
+        </w:rPr>
+        <w:t xml:space="preserve">        tension: 0.35, pointRadius: 0, borderWidth: 2 }] },</w:t>
+      </w:r>
+    </w:p>
+    <w:p>
+      <w:pPr>
+        <w:keepNext w:val="0"/>
+        <w:keepLines w:val="0"/>
+        <w:pageBreakBefore w:val="0"/>
+        <w:widowControl/>
+        <w:spacing w:line="240" w:lineRule="auto" w:before="0" w:after="0"/>
+        <w:jc w:val="left"/>
+      </w:pPr>
+      <w:r>
+        <w:rPr>
+          <w:rFonts w:ascii="Consolas" w:hAnsi="Consolas" w:eastAsia="Consolas" w:cs="Consolas"/>
+          <w:sz w:val="17"/>
+        </w:rPr>
+        <w:t xml:space="preserve">      options: { animation: { duration: 300 }, maintainAspectRatio: false,</w:t>
+      </w:r>
+    </w:p>
+    <w:p>
+      <w:pPr>
+        <w:keepNext w:val="0"/>
+        <w:keepLines w:val="0"/>
+        <w:pageBreakBefore w:val="0"/>
+        <w:widowControl/>
+        <w:spacing w:line="240" w:lineRule="auto" w:before="0" w:after="0"/>
+        <w:jc w:val="left"/>
+      </w:pPr>
+      <w:r>
+        <w:rPr>
+          <w:rFonts w:ascii="Consolas" w:hAnsi="Consolas" w:eastAsia="Consolas" w:cs="Consolas"/>
+          <w:sz w:val="17"/>
+        </w:rPr>
+        <w:t xml:space="preserve">        scales: { y: { beginAtZero: true } }, plugins: { legend: { display: false } } }</w:t>
       </w:r>
     </w:p>
     <w:p>
@@ -24448,6 +25910,142 @@
           <w:rFonts w:ascii="Consolas" w:hAnsi="Consolas" w:eastAsia="Consolas" w:cs="Consolas"/>
           <w:sz w:val="17"/>
         </w:rPr>
+        <w:t xml:space="preserve">    function setNum(name, value) {</w:t>
+      </w:r>
+    </w:p>
+    <w:p>
+      <w:pPr>
+        <w:keepNext w:val="0"/>
+        <w:keepLines w:val="0"/>
+        <w:pageBreakBefore w:val="0"/>
+        <w:widowControl/>
+        <w:spacing w:line="240" w:lineRule="auto" w:before="0" w:after="0"/>
+        <w:jc w:val="left"/>
+      </w:pPr>
+      <w:r>
+        <w:rPr>
+          <w:rFonts w:ascii="Consolas" w:hAnsi="Consolas" w:eastAsia="Consolas" w:cs="Consolas"/>
+          <w:sz w:val="17"/>
+        </w:rPr>
+        <w:t xml:space="preserve">      const el = document.getElementById(name);</w:t>
+      </w:r>
+    </w:p>
+    <w:p>
+      <w:pPr>
+        <w:keepNext w:val="0"/>
+        <w:keepLines w:val="0"/>
+        <w:pageBreakBefore w:val="0"/>
+        <w:widowControl/>
+        <w:spacing w:line="240" w:lineRule="auto" w:before="0" w:after="0"/>
+        <w:jc w:val="left"/>
+      </w:pPr>
+      <w:r>
+        <w:rPr>
+          <w:rFonts w:ascii="Consolas" w:hAnsi="Consolas" w:eastAsia="Consolas" w:cs="Consolas"/>
+          <w:sz w:val="17"/>
+        </w:rPr>
+        <w:t xml:space="preserve">      if (el.textContent !== String(value)) {</w:t>
+      </w:r>
+    </w:p>
+    <w:p>
+      <w:pPr>
+        <w:keepNext w:val="0"/>
+        <w:keepLines w:val="0"/>
+        <w:pageBreakBefore w:val="0"/>
+        <w:widowControl/>
+        <w:spacing w:line="240" w:lineRule="auto" w:before="0" w:after="0"/>
+        <w:jc w:val="left"/>
+      </w:pPr>
+      <w:r>
+        <w:rPr>
+          <w:rFonts w:ascii="Consolas" w:hAnsi="Consolas" w:eastAsia="Consolas" w:cs="Consolas"/>
+          <w:sz w:val="17"/>
+        </w:rPr>
+        <w:t xml:space="preserve">        el.textContent = value;</w:t>
+      </w:r>
+    </w:p>
+    <w:p>
+      <w:pPr>
+        <w:keepNext w:val="0"/>
+        <w:keepLines w:val="0"/>
+        <w:pageBreakBefore w:val="0"/>
+        <w:widowControl/>
+        <w:spacing w:line="240" w:lineRule="auto" w:before="0" w:after="0"/>
+        <w:jc w:val="left"/>
+      </w:pPr>
+      <w:r>
+        <w:rPr>
+          <w:rFonts w:ascii="Consolas" w:hAnsi="Consolas" w:eastAsia="Consolas" w:cs="Consolas"/>
+          <w:sz w:val="17"/>
+        </w:rPr>
+        <w:t xml:space="preserve">        el.classList.remove("bump"); void el.offsetWidth; el.classList.add("bump");</w:t>
+      </w:r>
+    </w:p>
+    <w:p>
+      <w:pPr>
+        <w:keepNext w:val="0"/>
+        <w:keepLines w:val="0"/>
+        <w:pageBreakBefore w:val="0"/>
+        <w:widowControl/>
+        <w:spacing w:line="240" w:lineRule="auto" w:before="0" w:after="0"/>
+        <w:jc w:val="left"/>
+      </w:pPr>
+      <w:r>
+        <w:rPr>
+          <w:rFonts w:ascii="Consolas" w:hAnsi="Consolas" w:eastAsia="Consolas" w:cs="Consolas"/>
+          <w:sz w:val="17"/>
+        </w:rPr>
+        <w:t xml:space="preserve">      }</w:t>
+      </w:r>
+    </w:p>
+    <w:p>
+      <w:pPr>
+        <w:keepNext w:val="0"/>
+        <w:keepLines w:val="0"/>
+        <w:pageBreakBefore w:val="0"/>
+        <w:widowControl/>
+        <w:spacing w:line="240" w:lineRule="auto" w:before="0" w:after="0"/>
+        <w:jc w:val="left"/>
+      </w:pPr>
+      <w:r>
+        <w:rPr>
+          <w:rFonts w:ascii="Consolas" w:hAnsi="Consolas" w:eastAsia="Consolas" w:cs="Consolas"/>
+          <w:sz w:val="17"/>
+        </w:rPr>
+        <w:t xml:space="preserve">    }</w:t>
+      </w:r>
+    </w:p>
+    <w:p>
+      <w:pPr>
+        <w:keepNext w:val="0"/>
+        <w:keepLines w:val="0"/>
+        <w:pageBreakBefore w:val="0"/>
+        <w:widowControl/>
+        <w:spacing w:line="240" w:lineRule="auto" w:before="0" w:after="0"/>
+        <w:jc w:val="left"/>
+      </w:pPr>
+      <w:r>
+        <w:rPr>
+          <w:rFonts w:ascii="Consolas" w:hAnsi="Consolas" w:eastAsia="Consolas" w:cs="Consolas"/>
+          <w:sz w:val="17"/>
+        </w:rPr>
+        <w:t xml:space="preserve"> </w:t>
+      </w:r>
+    </w:p>
+    <w:p>
+      <w:pPr>
+        <w:keepNext w:val="0"/>
+        <w:keepLines w:val="0"/>
+        <w:pageBreakBefore w:val="0"/>
+        <w:widowControl/>
+        <w:spacing w:line="240" w:lineRule="auto" w:before="0" w:after="0"/>
+        <w:jc w:val="left"/>
+      </w:pPr>
+      <w:r>
+        <w:rPr>
+          <w:rFonts w:ascii="Consolas" w:hAnsi="Consolas" w:eastAsia="Consolas" w:cs="Consolas"/>
+          <w:sz w:val="17"/>
+        </w:rPr>
         <w:t xml:space="preserve">    socket.on("stats", data =&gt; {</w:t>
       </w:r>
     </w:p>
@@ -24465,7 +26063,7 @@
           <w:rFonts w:ascii="Consolas" w:hAnsi="Consolas" w:eastAsia="Consolas" w:cs="Consolas"/>
           <w:sz w:val="17"/>
         </w:rPr>
-        <w:t xml:space="preserve">      for (const name in data) document.getElementById(name).textContent = data[name];</w:t>
+        <w:t xml:space="preserve">      for (const name in data) setNum(name, data[name]);</w:t>
       </w:r>
     </w:p>
     <w:p>
@@ -24601,7 +26199,41 @@
           <w:rFonts w:ascii="Consolas" w:hAnsi="Consolas" w:eastAsia="Consolas" w:cs="Consolas"/>
           <w:sz w:val="17"/>
         </w:rPr>
-        <w:t xml:space="preserve">    function addRow(alert, top) {</w:t>
+        <w:t xml:space="preserve">    function addRow(alert, live) {</w:t>
+      </w:r>
+    </w:p>
+    <w:p>
+      <w:pPr>
+        <w:keepNext w:val="0"/>
+        <w:keepLines w:val="0"/>
+        <w:pageBreakBefore w:val="0"/>
+        <w:widowControl/>
+        <w:spacing w:line="240" w:lineRule="auto" w:before="0" w:after="0"/>
+        <w:jc w:val="left"/>
+      </w:pPr>
+      <w:r>
+        <w:rPr>
+          <w:rFonts w:ascii="Consolas" w:hAnsi="Consolas" w:eastAsia="Consolas" w:cs="Consolas"/>
+          <w:sz w:val="17"/>
+        </w:rPr>
+        <w:t xml:space="preserve">      const empty = document.getElementById("empty");</w:t>
+      </w:r>
+    </w:p>
+    <w:p>
+      <w:pPr>
+        <w:keepNext w:val="0"/>
+        <w:keepLines w:val="0"/>
+        <w:pageBreakBefore w:val="0"/>
+        <w:widowControl/>
+        <w:spacing w:line="240" w:lineRule="auto" w:before="0" w:after="0"/>
+        <w:jc w:val="left"/>
+      </w:pPr>
+      <w:r>
+        <w:rPr>
+          <w:rFonts w:ascii="Consolas" w:hAnsi="Consolas" w:eastAsia="Consolas" w:cs="Consolas"/>
+          <w:sz w:val="17"/>
+        </w:rPr>
+        <w:t xml:space="preserve">      if (empty) empty.remove();</w:t>
       </w:r>
     </w:p>
     <w:p>
@@ -24635,6 +26267,23 @@
           <w:rFonts w:ascii="Consolas" w:hAnsi="Consolas" w:eastAsia="Consolas" w:cs="Consolas"/>
           <w:sz w:val="17"/>
         </w:rPr>
+        <w:t xml:space="preserve">      if (live) row.className = "new flash";</w:t>
+      </w:r>
+    </w:p>
+    <w:p>
+      <w:pPr>
+        <w:keepNext w:val="0"/>
+        <w:keepLines w:val="0"/>
+        <w:pageBreakBefore w:val="0"/>
+        <w:widowControl/>
+        <w:spacing w:line="240" w:lineRule="auto" w:before="0" w:after="0"/>
+        <w:jc w:val="left"/>
+      </w:pPr>
+      <w:r>
+        <w:rPr>
+          <w:rFonts w:ascii="Consolas" w:hAnsi="Consolas" w:eastAsia="Consolas" w:cs="Consolas"/>
+          <w:sz w:val="17"/>
+        </w:rPr>
         <w:t xml:space="preserve">      for (const value of [alert.date, alert.time, alert.type, alert.severity, alert.src, alert.dst, alert.detail]) {</w:t>
       </w:r>
     </w:p>
@@ -24856,7 +26505,7 @@
           <w:rFonts w:ascii="Consolas" w:hAnsi="Consolas" w:eastAsia="Consolas" w:cs="Consolas"/>
           <w:sz w:val="17"/>
         </w:rPr>
-        <w:t xml:space="preserve">      top ? body.prepend(row) : body.appendChild(row);</w:t>
+        <w:t xml:space="preserve">      live ? body.prepend(row) : body.appendChild(row);</w:t>
       </w:r>
     </w:p>
     <w:p>
@@ -24992,6 +26641,23 @@
           <w:rFonts w:ascii="Consolas" w:hAnsi="Consolas" w:eastAsia="Consolas" w:cs="Consolas"/>
           <w:sz w:val="17"/>
         </w:rPr>
+        <w:t xml:space="preserve">    let bannerTimer;</w:t>
+      </w:r>
+    </w:p>
+    <w:p>
+      <w:pPr>
+        <w:keepNext w:val="0"/>
+        <w:keepLines w:val="0"/>
+        <w:pageBreakBefore w:val="0"/>
+        <w:widowControl/>
+        <w:spacing w:line="240" w:lineRule="auto" w:before="0" w:after="0"/>
+        <w:jc w:val="left"/>
+      </w:pPr>
+      <w:r>
+        <w:rPr>
+          <w:rFonts w:ascii="Consolas" w:hAnsi="Consolas" w:eastAsia="Consolas" w:cs="Consolas"/>
+          <w:sz w:val="17"/>
+        </w:rPr>
         <w:t xml:space="preserve">    socket.on("alert", alert =&gt; {</w:t>
       </w:r>
     </w:p>
@@ -25060,41 +26726,41 @@
           <w:rFonts w:ascii="Consolas" w:hAnsi="Consolas" w:eastAsia="Consolas" w:cs="Consolas"/>
           <w:sz w:val="17"/>
         </w:rPr>
-        <w:t xml:space="preserve">      banner.className = alert.severity;</w:t>
-      </w:r>
-    </w:p>
-    <w:p>
-      <w:pPr>
-        <w:keepNext w:val="0"/>
-        <w:keepLines w:val="0"/>
-        <w:pageBreakBefore w:val="0"/>
-        <w:widowControl/>
-        <w:spacing w:line="240" w:lineRule="auto" w:before="0" w:after="0"/>
-        <w:jc w:val="left"/>
-      </w:pPr>
-      <w:r>
-        <w:rPr>
-          <w:rFonts w:ascii="Consolas" w:hAnsi="Consolas" w:eastAsia="Consolas" w:cs="Consolas"/>
-          <w:sz w:val="17"/>
-        </w:rPr>
-        <w:t xml:space="preserve">      banner.hidden = false;</w:t>
-      </w:r>
-    </w:p>
-    <w:p>
-      <w:pPr>
-        <w:keepNext w:val="0"/>
-        <w:keepLines w:val="0"/>
-        <w:pageBreakBefore w:val="0"/>
-        <w:widowControl/>
-        <w:spacing w:line="240" w:lineRule="auto" w:before="0" w:after="0"/>
-        <w:jc w:val="left"/>
-      </w:pPr>
-      <w:r>
-        <w:rPr>
-          <w:rFonts w:ascii="Consolas" w:hAnsi="Consolas" w:eastAsia="Consolas" w:cs="Consolas"/>
-          <w:sz w:val="17"/>
-        </w:rPr>
-        <w:t xml:space="preserve">      setTimeout(() =&gt; banner.hidden = true, 6000);</w:t>
+        <w:t xml:space="preserve">      banner.className = alert.severity + " show";</w:t>
+      </w:r>
+    </w:p>
+    <w:p>
+      <w:pPr>
+        <w:keepNext w:val="0"/>
+        <w:keepLines w:val="0"/>
+        <w:pageBreakBefore w:val="0"/>
+        <w:widowControl/>
+        <w:spacing w:line="240" w:lineRule="auto" w:before="0" w:after="0"/>
+        <w:jc w:val="left"/>
+      </w:pPr>
+      <w:r>
+        <w:rPr>
+          <w:rFonts w:ascii="Consolas" w:hAnsi="Consolas" w:eastAsia="Consolas" w:cs="Consolas"/>
+          <w:sz w:val="17"/>
+        </w:rPr>
+        <w:t xml:space="preserve">      clearTimeout(bannerTimer);</w:t>
+      </w:r>
+    </w:p>
+    <w:p>
+      <w:pPr>
+        <w:keepNext w:val="0"/>
+        <w:keepLines w:val="0"/>
+        <w:pageBreakBefore w:val="0"/>
+        <w:widowControl/>
+        <w:spacing w:line="240" w:lineRule="auto" w:before="0" w:after="0"/>
+        <w:jc w:val="left"/>
+      </w:pPr>
+      <w:r>
+        <w:rPr>
+          <w:rFonts w:ascii="Consolas" w:hAnsi="Consolas" w:eastAsia="Consolas" w:cs="Consolas"/>
+          <w:sz w:val="17"/>
+        </w:rPr>
+        <w:t xml:space="preserve">      bannerTimer = setTimeout(() =&gt; banner.classList.remove("show"), 6000);</w:t>
       </w:r>
     </w:p>
     <w:p>

</xml_diff>

<commit_message>
Certificate page: blank name and signature blocks for coordinator, HOD and dean
</commit_message>
<xml_diff>
--- a/report/NIDS_Mini_Project_Report.docx
+++ b/report/NIDS_Mini_Project_Report.docx
@@ -822,7 +822,7 @@
         <w:keepLines w:val="0"/>
         <w:pageBreakBefore w:val="0"/>
         <w:widowControl/>
-        <w:spacing w:line="360" w:lineRule="auto" w:before="0" w:after="720"/>
+        <w:spacing w:line="360" w:lineRule="auto" w:before="0" w:after="360"/>
         <w:jc w:val="both"/>
       </w:pPr>
       <w:r>
@@ -839,24 +839,7 @@
         <w:keepLines w:val="0"/>
         <w:pageBreakBefore w:val="0"/>
         <w:widowControl/>
-        <w:spacing w:line="360" w:lineRule="auto" w:before="0" w:after="0"/>
-        <w:jc w:val="left"/>
-      </w:pPr>
-      <w:r>
-        <w:rPr>
-          <w:rFonts w:ascii="Times New Roman" w:hAnsi="Times New Roman" w:eastAsia="Times New Roman" w:cs="Times New Roman"/>
-          <w:sz w:val="22"/>
-        </w:rPr>
-        <w:t>______________________</w:t>
-      </w:r>
-    </w:p>
-    <w:p>
-      <w:pPr>
-        <w:keepNext w:val="0"/>
-        <w:keepLines w:val="0"/>
-        <w:pageBreakBefore w:val="0"/>
-        <w:widowControl/>
-        <w:spacing w:line="360" w:lineRule="auto" w:before="0" w:after="40"/>
+        <w:spacing w:line="312" w:lineRule="auto" w:before="0" w:after="0"/>
         <w:jc w:val="left"/>
       </w:pPr>
       <w:r>
@@ -865,65 +848,150 @@
           <w:b/>
           <w:sz w:val="22"/>
         </w:rPr>
-        <w:t>Mr. Vikas</w:t>
-      </w:r>
-      <w:r>
-        <w:rPr>
-          <w:rFonts w:ascii="Times New Roman" w:hAnsi="Times New Roman" w:eastAsia="Times New Roman" w:cs="Times New Roman"/>
-          <w:sz w:val="22"/>
-        </w:rPr>
-        <w:t xml:space="preserve">    (Project Guide)</w:t>
-      </w:r>
-    </w:p>
-    <w:p>
-      <w:pPr>
-        <w:keepNext w:val="0"/>
-        <w:keepLines w:val="0"/>
-        <w:pageBreakBefore w:val="0"/>
-        <w:widowControl/>
-        <w:spacing w:line="360" w:lineRule="auto" w:before="0" w:after="600"/>
-        <w:jc w:val="left"/>
-      </w:pPr>
-      <w:r>
-        <w:rPr>
-          <w:rFonts w:ascii="Times New Roman" w:hAnsi="Times New Roman" w:eastAsia="Times New Roman" w:cs="Times New Roman"/>
-          <w:sz w:val="22"/>
-        </w:rPr>
-        <w:t>Assistant Professor, Department of Computer Science &amp; Engineering &amp; Allied Branches</w:t>
-      </w:r>
-    </w:p>
-    <w:p>
-      <w:pPr>
-        <w:keepNext w:val="0"/>
-        <w:keepLines w:val="0"/>
-        <w:pageBreakBefore w:val="0"/>
-        <w:widowControl/>
-        <w:spacing w:line="360" w:lineRule="auto" w:before="0" w:after="40"/>
-        <w:jc w:val="left"/>
-      </w:pPr>
-      <w:r>
-        <w:rPr>
-          <w:rFonts w:ascii="Times New Roman" w:hAnsi="Times New Roman" w:eastAsia="Times New Roman" w:cs="Times New Roman"/>
-          <w:sz w:val="22"/>
-        </w:rPr>
-        <w:t>Date: ______________</w:t>
-      </w:r>
-    </w:p>
-    <w:p>
-      <w:pPr>
-        <w:keepNext w:val="0"/>
-        <w:keepLines w:val="0"/>
-        <w:pageBreakBefore w:val="0"/>
-        <w:widowControl/>
-        <w:spacing w:line="360" w:lineRule="auto" w:before="0" w:after="120"/>
-        <w:jc w:val="left"/>
-      </w:pPr>
-      <w:r>
-        <w:rPr>
-          <w:rFonts w:ascii="Times New Roman" w:hAnsi="Times New Roman" w:eastAsia="Times New Roman" w:cs="Times New Roman"/>
-          <w:sz w:val="22"/>
-        </w:rPr>
-        <w:t>Place: Greater Noida</w:t>
+        <w:t xml:space="preserve">Project Guide: </w:t>
+      </w:r>
+      <w:r>
+        <w:rPr>
+          <w:rFonts w:ascii="Times New Roman" w:hAnsi="Times New Roman" w:eastAsia="Times New Roman" w:cs="Times New Roman"/>
+          <w:sz w:val="22"/>
+        </w:rPr>
+        <w:t>Mr. Vikas, Assistant Professor</w:t>
+      </w:r>
+    </w:p>
+    <w:p>
+      <w:pPr>
+        <w:keepNext w:val="0"/>
+        <w:keepLines w:val="0"/>
+        <w:pageBreakBefore w:val="0"/>
+        <w:widowControl/>
+        <w:spacing w:line="312" w:lineRule="auto" w:before="0" w:after="240"/>
+        <w:jc w:val="left"/>
+      </w:pPr>
+      <w:r>
+        <w:rPr>
+          <w:rFonts w:ascii="Times New Roman" w:hAnsi="Times New Roman" w:eastAsia="Times New Roman" w:cs="Times New Roman"/>
+          <w:sz w:val="22"/>
+        </w:rPr>
+        <w:t>Signature: ____________________</w:t>
+      </w:r>
+    </w:p>
+    <w:p>
+      <w:pPr>
+        <w:keepNext w:val="0"/>
+        <w:keepLines w:val="0"/>
+        <w:pageBreakBefore w:val="0"/>
+        <w:widowControl/>
+        <w:spacing w:line="312" w:lineRule="auto" w:before="0" w:after="0"/>
+        <w:jc w:val="left"/>
+      </w:pPr>
+      <w:r>
+        <w:rPr>
+          <w:rFonts w:ascii="Times New Roman" w:hAnsi="Times New Roman" w:eastAsia="Times New Roman" w:cs="Times New Roman"/>
+          <w:sz w:val="22"/>
+        </w:rPr>
+        <w:t>Name: ______________________________   Designation: ____________________</w:t>
+      </w:r>
+    </w:p>
+    <w:p>
+      <w:pPr>
+        <w:keepNext w:val="0"/>
+        <w:keepLines w:val="0"/>
+        <w:pageBreakBefore w:val="0"/>
+        <w:widowControl/>
+        <w:spacing w:line="312" w:lineRule="auto" w:before="0" w:after="240"/>
+        <w:jc w:val="left"/>
+      </w:pPr>
+      <w:r>
+        <w:rPr>
+          <w:rFonts w:ascii="Times New Roman" w:hAnsi="Times New Roman" w:eastAsia="Times New Roman" w:cs="Times New Roman"/>
+          <w:sz w:val="22"/>
+        </w:rPr>
+        <w:t>Signature: ____________________</w:t>
+      </w:r>
+    </w:p>
+    <w:p>
+      <w:pPr>
+        <w:keepNext w:val="0"/>
+        <w:keepLines w:val="0"/>
+        <w:pageBreakBefore w:val="0"/>
+        <w:widowControl/>
+        <w:spacing w:line="312" w:lineRule="auto" w:before="0" w:after="0"/>
+        <w:jc w:val="left"/>
+      </w:pPr>
+      <w:r>
+        <w:rPr>
+          <w:rFonts w:ascii="Times New Roman" w:hAnsi="Times New Roman" w:eastAsia="Times New Roman" w:cs="Times New Roman"/>
+          <w:sz w:val="22"/>
+        </w:rPr>
+        <w:t>Name: ______________________________   Designation: ____________________</w:t>
+      </w:r>
+    </w:p>
+    <w:p>
+      <w:pPr>
+        <w:keepNext w:val="0"/>
+        <w:keepLines w:val="0"/>
+        <w:pageBreakBefore w:val="0"/>
+        <w:widowControl/>
+        <w:spacing w:line="312" w:lineRule="auto" w:before="0" w:after="240"/>
+        <w:jc w:val="left"/>
+      </w:pPr>
+      <w:r>
+        <w:rPr>
+          <w:rFonts w:ascii="Times New Roman" w:hAnsi="Times New Roman" w:eastAsia="Times New Roman" w:cs="Times New Roman"/>
+          <w:sz w:val="22"/>
+        </w:rPr>
+        <w:t>Signature: ____________________</w:t>
+      </w:r>
+    </w:p>
+    <w:p>
+      <w:pPr>
+        <w:keepNext w:val="0"/>
+        <w:keepLines w:val="0"/>
+        <w:pageBreakBefore w:val="0"/>
+        <w:widowControl/>
+        <w:spacing w:line="312" w:lineRule="auto" w:before="0" w:after="0"/>
+        <w:jc w:val="left"/>
+      </w:pPr>
+      <w:r>
+        <w:rPr>
+          <w:rFonts w:ascii="Times New Roman" w:hAnsi="Times New Roman" w:eastAsia="Times New Roman" w:cs="Times New Roman"/>
+          <w:sz w:val="22"/>
+        </w:rPr>
+        <w:t>Name: ______________________________   Designation: ____________________</w:t>
+      </w:r>
+    </w:p>
+    <w:p>
+      <w:pPr>
+        <w:keepNext w:val="0"/>
+        <w:keepLines w:val="0"/>
+        <w:pageBreakBefore w:val="0"/>
+        <w:widowControl/>
+        <w:spacing w:line="312" w:lineRule="auto" w:before="0" w:after="240"/>
+        <w:jc w:val="left"/>
+      </w:pPr>
+      <w:r>
+        <w:rPr>
+          <w:rFonts w:ascii="Times New Roman" w:hAnsi="Times New Roman" w:eastAsia="Times New Roman" w:cs="Times New Roman"/>
+          <w:sz w:val="22"/>
+        </w:rPr>
+        <w:t>Signature: ____________________</w:t>
+      </w:r>
+    </w:p>
+    <w:p>
+      <w:pPr>
+        <w:keepNext w:val="0"/>
+        <w:keepLines w:val="0"/>
+        <w:pageBreakBefore w:val="0"/>
+        <w:widowControl/>
+        <w:spacing w:line="312" w:lineRule="auto" w:before="0" w:after="120"/>
+        <w:jc w:val="left"/>
+      </w:pPr>
+      <w:r>
+        <w:rPr>
+          <w:rFonts w:ascii="Times New Roman" w:hAnsi="Times New Roman" w:eastAsia="Times New Roman" w:cs="Times New Roman"/>
+          <w:sz w:val="22"/>
+        </w:rPr>
+        <w:t>Date: ______________        Place: Greater Noida</w:t>
       </w:r>
     </w:p>
     <w:p>

</xml_diff>

<commit_message>
Report: faculty names on certificate and acknowledgement, resume attached as Appendix B
</commit_message>
<xml_diff>
--- a/report/NIDS_Mini_Project_Report.docx
+++ b/report/NIDS_Mini_Project_Report.docx
@@ -887,9 +887,17 @@
       <w:r>
         <w:rPr>
           <w:rFonts w:ascii="Times New Roman" w:hAnsi="Times New Roman" w:eastAsia="Times New Roman" w:cs="Times New Roman"/>
-          <w:sz w:val="22"/>
-        </w:rPr>
-        <w:t>Name: ______________________________   Designation: ____________________</w:t>
+          <w:b/>
+          <w:sz w:val="22"/>
+        </w:rPr>
+        <w:t xml:space="preserve">Project Coordinator: </w:t>
+      </w:r>
+      <w:r>
+        <w:rPr>
+          <w:rFonts w:ascii="Times New Roman" w:hAnsi="Times New Roman" w:eastAsia="Times New Roman" w:cs="Times New Roman"/>
+          <w:sz w:val="22"/>
+        </w:rPr>
+        <w:t>Mr. Vishal Gupta, Assistant Professor</w:t>
       </w:r>
     </w:p>
     <w:p>
@@ -921,9 +929,17 @@
       <w:r>
         <w:rPr>
           <w:rFonts w:ascii="Times New Roman" w:hAnsi="Times New Roman" w:eastAsia="Times New Roman" w:cs="Times New Roman"/>
-          <w:sz w:val="22"/>
-        </w:rPr>
-        <w:t>Name: ______________________________   Designation: ____________________</w:t>
+          <w:b/>
+          <w:sz w:val="22"/>
+        </w:rPr>
+        <w:t xml:space="preserve">Deputy Head, Department of CSE: </w:t>
+      </w:r>
+      <w:r>
+        <w:rPr>
+          <w:rFonts w:ascii="Times New Roman" w:hAnsi="Times New Roman" w:eastAsia="Times New Roman" w:cs="Times New Roman"/>
+          <w:sz w:val="22"/>
+        </w:rPr>
+        <w:t>Ms. Deepika Arora, Assistant Professor</w:t>
       </w:r>
     </w:p>
     <w:p>
@@ -955,9 +971,17 @@
       <w:r>
         <w:rPr>
           <w:rFonts w:ascii="Times New Roman" w:hAnsi="Times New Roman" w:eastAsia="Times New Roman" w:cs="Times New Roman"/>
-          <w:sz w:val="22"/>
-        </w:rPr>
-        <w:t>Name: ______________________________   Designation: ____________________</w:t>
+          <w:b/>
+          <w:sz w:val="22"/>
+        </w:rPr>
+        <w:t xml:space="preserve">Dean Academics: </w:t>
+      </w:r>
+      <w:r>
+        <w:rPr>
+          <w:rFonts w:ascii="Times New Roman" w:hAnsi="Times New Roman" w:eastAsia="Times New Roman" w:cs="Times New Roman"/>
+          <w:sz w:val="22"/>
+        </w:rPr>
+        <w:t>Prof. (Dr.) Kumud Saxena, Professor</w:t>
       </w:r>
     </w:p>
     <w:p>
@@ -1203,7 +1227,52 @@
           <w:rFonts w:ascii="Times New Roman" w:hAnsi="Times New Roman" w:eastAsia="Times New Roman" w:cs="Times New Roman"/>
           <w:sz w:val="22"/>
         </w:rPr>
-        <w:t>I am thankful to the Project Coordinator and the Head of the Department of Computer Science and Engineering for providing the necessary facilities and a supportive academic environment. Their support made it possible to carry out this work smoothly.</w:t>
+        <w:t xml:space="preserve">I am thankful to </w:t>
+      </w:r>
+      <w:r>
+        <w:rPr>
+          <w:rFonts w:ascii="Times New Roman" w:hAnsi="Times New Roman" w:eastAsia="Times New Roman" w:cs="Times New Roman"/>
+          <w:b/>
+          <w:sz w:val="22"/>
+        </w:rPr>
+        <w:t>Mr. Vishal Gupta</w:t>
+      </w:r>
+      <w:r>
+        <w:rPr>
+          <w:rFonts w:ascii="Times New Roman" w:hAnsi="Times New Roman" w:eastAsia="Times New Roman" w:cs="Times New Roman"/>
+          <w:sz w:val="22"/>
+        </w:rPr>
+        <w:t xml:space="preserve">, Project Coordinator, </w:t>
+      </w:r>
+      <w:r>
+        <w:rPr>
+          <w:rFonts w:ascii="Times New Roman" w:hAnsi="Times New Roman" w:eastAsia="Times New Roman" w:cs="Times New Roman"/>
+          <w:b/>
+          <w:sz w:val="22"/>
+        </w:rPr>
+        <w:t>Ms. Deepika Arora</w:t>
+      </w:r>
+      <w:r>
+        <w:rPr>
+          <w:rFonts w:ascii="Times New Roman" w:hAnsi="Times New Roman" w:eastAsia="Times New Roman" w:cs="Times New Roman"/>
+          <w:sz w:val="22"/>
+        </w:rPr>
+        <w:t xml:space="preserve">, Deputy Head of the Department of Computer Science and Engineering, and </w:t>
+      </w:r>
+      <w:r>
+        <w:rPr>
+          <w:rFonts w:ascii="Times New Roman" w:hAnsi="Times New Roman" w:eastAsia="Times New Roman" w:cs="Times New Roman"/>
+          <w:b/>
+          <w:sz w:val="22"/>
+        </w:rPr>
+        <w:t>Prof. (Dr.) Kumud Saxena</w:t>
+      </w:r>
+      <w:r>
+        <w:rPr>
+          <w:rFonts w:ascii="Times New Roman" w:hAnsi="Times New Roman" w:eastAsia="Times New Roman" w:cs="Times New Roman"/>
+          <w:sz w:val="22"/>
+        </w:rPr>
+        <w:t>, Dean Academics, for providing the necessary facilities and a supportive academic environment. Their support made it possible to carry out this work smoothly.</w:t>
       </w:r>
     </w:p>
     <w:p>
@@ -3202,6 +3271,37 @@
         </w:rPr>
         <w:tab/>
         <w:t>41</w:t>
+      </w:r>
+    </w:p>
+    <w:p>
+      <w:pPr>
+        <w:keepNext w:val="0"/>
+        <w:keepLines w:val="0"/>
+        <w:pageBreakBefore w:val="0"/>
+        <w:widowControl/>
+        <w:tabs>
+          <w:tab w:pos="8280" w:val="right" w:leader="dot"/>
+        </w:tabs>
+        <w:spacing w:line="312" w:lineRule="auto" w:before="20" w:after="20"/>
+        <w:ind w:left="0"/>
+        <w:jc w:val="left"/>
+      </w:pPr>
+      <w:r>
+        <w:rPr>
+          <w:rFonts w:ascii="Times New Roman" w:hAnsi="Times New Roman" w:eastAsia="Times New Roman" w:cs="Times New Roman"/>
+          <w:b/>
+          <w:sz w:val="22"/>
+        </w:rPr>
+        <w:t>APPENDIX B: RESUME</w:t>
+      </w:r>
+      <w:r>
+        <w:rPr>
+          <w:rFonts w:ascii="Times New Roman" w:hAnsi="Times New Roman" w:eastAsia="Times New Roman" w:cs="Times New Roman"/>
+          <w:b/>
+          <w:sz w:val="22"/>
+        </w:rPr>
+        <w:tab/>
+        <w:t>50</w:t>
       </w:r>
     </w:p>
     <w:p>
@@ -28888,6 +28988,87 @@
           <w:sz w:val="17"/>
         </w:rPr>
         <w:t xml:space="preserve">    unittest.main(verbosity=2)</w:t>
+      </w:r>
+    </w:p>
+    <w:p>
+      <w:pPr>
+        <w:pStyle w:val="Heading1"/>
+        <w:keepNext/>
+        <w:keepLines w:val="0"/>
+        <w:pageBreakBefore/>
+        <w:widowControl/>
+        <w:spacing w:line="360" w:lineRule="auto" w:before="0" w:after="160"/>
+        <w:jc w:val="left"/>
+      </w:pPr>
+      <w:r>
+        <w:rPr>
+          <w:rFonts w:ascii="Times New Roman" w:hAnsi="Times New Roman" w:eastAsia="Times New Roman" w:cs="Times New Roman"/>
+          <w:b/>
+          <w:color w:val="000000"/>
+          <w:sz w:val="30"/>
+        </w:rPr>
+        <w:t>APPENDIX B: RESUME</w:t>
+      </w:r>
+    </w:p>
+    <w:p>
+      <w:pPr>
+        <w:keepNext w:val="0"/>
+        <w:keepLines w:val="0"/>
+        <w:pageBreakBefore w:val="0"/>
+        <w:widowControl/>
+        <w:spacing w:line="360" w:lineRule="auto" w:before="0" w:after="120"/>
+        <w:jc w:val="both"/>
+      </w:pPr>
+      <w:r>
+        <w:rPr>
+          <w:rFonts w:ascii="Times New Roman" w:hAnsi="Times New Roman" w:eastAsia="Times New Roman" w:cs="Times New Roman"/>
+          <w:sz w:val="22"/>
+        </w:rPr>
+        <w:t>The updated resume of the student is attached below, as required for the spiral-bound copy of the report.</w:t>
+      </w:r>
+    </w:p>
+    <w:p>
+      <w:pPr>
+        <w:keepNext w:val="0"/>
+        <w:keepLines w:val="0"/>
+        <w:pageBreakBefore w:val="0"/>
+        <w:widowControl/>
+        <w:spacing w:line="240" w:lineRule="auto" w:before="80" w:after="0"/>
+        <w:jc w:val="center"/>
+      </w:pPr>
+      <w:r>
+        <w:drawing>
+          <wp:inline>
+            <wp:extent cx="5257800" cy="6804212"/>
+            <wp:docPr id="18" name="Picture 18"/>
+            <wp:cNvGraphicFramePr>
+              <a:graphicFrameLocks noChangeAspect="1"/>
+            </wp:cNvGraphicFramePr>
+            <a:graphic>
+              <a:graphicData uri="http://schemas.openxmlformats.org/drawingml/2006/picture">
+                <pic:pic>
+                  <pic:nvPicPr>
+                    <pic:cNvPr id="0" name="resume_page.png"/>
+                    <pic:cNvPicPr/>
+                  </pic:nvPicPr>
+                  <pic:blipFill>
+                    <a:blip r:embed="rId29"/>
+                    <a:stretch>
+                      <a:fillRect/>
+                    </a:stretch>
+                  </pic:blipFill>
+                  <pic:spPr>
+                    <a:xfrm>
+                      <a:off x="0" y="0"/>
+                      <a:ext cx="5257800" cy="6804212"/>
+                    </a:xfrm>
+                    <a:prstGeom prst="rect"/>
+                  </pic:spPr>
+                </pic:pic>
+              </a:graphicData>
+            </a:graphic>
+          </wp:inline>
+        </w:drawing>
       </w:r>
     </w:p>
     <w:sectPr>

</xml_diff>

<commit_message>
Report: two-line centred cover title, side-by-side signature grid on the certificate
</commit_message>
<xml_diff>
--- a/report/NIDS_Mini_Project_Report.docx
+++ b/report/NIDS_Mini_Project_Report.docx
@@ -5,7 +5,8 @@
     <w:p>
       <w:pPr>
         <w:spacing w:line="240" w:lineRule="auto"/>
-        <w:ind w:left="2160" w:firstLine="720"/>
+        <w:ind w:left="0" w:firstLine="0" w:right="0"/>
+        <w:jc w:val="center"/>
         <w:rPr>
           <w:sz w:val="28"/>
           <w:szCs w:val="28"/>
@@ -17,7 +18,6 @@
           <w:szCs w:val="20"/>
           <w:rtl w:val="0"/>
         </w:rPr>
-        <w:t xml:space="preserve">      </w:t>
       </w:r>
       <w:r>
         <w:rPr>
@@ -29,7 +29,9 @@
           <w:szCs w:val="28"/>
           <w:rtl w:val="0"/>
         </w:rPr>
-        <w:t xml:space="preserve">Real-Time Network Intrusion Detection System (NIDS) using Packet Inspection and Web-Based Alerting</w:t>
+        <w:t>Real-Time Network Intrusion Detection System (NIDS)</w:t>
+        <w:br/>
+        <w:t>using Packet Inspection and Web-Based Alerting</w:t>
       </w:r>
       <w:r>
         <w:rPr>
@@ -833,181 +835,255 @@
         <w:t>The work embodied in this report has not been submitted elsewhere for the award of any other degree or diploma. To the best of my knowledge, the report fulfils the prescribed structure and formatting requirements of the Mini Project guidelines.</w:t>
       </w:r>
     </w:p>
-    <w:p>
-      <w:pPr>
-        <w:keepNext w:val="0"/>
-        <w:keepLines w:val="0"/>
-        <w:pageBreakBefore w:val="0"/>
-        <w:widowControl/>
-        <w:spacing w:line="312" w:lineRule="auto" w:before="0" w:after="0"/>
-        <w:jc w:val="left"/>
-      </w:pPr>
-      <w:r>
-        <w:rPr>
-          <w:rFonts w:ascii="Times New Roman" w:hAnsi="Times New Roman" w:eastAsia="Times New Roman" w:cs="Times New Roman"/>
-          <w:b/>
-          <w:sz w:val="22"/>
-        </w:rPr>
-        <w:t xml:space="preserve">Project Guide: </w:t>
-      </w:r>
-      <w:r>
-        <w:rPr>
-          <w:rFonts w:ascii="Times New Roman" w:hAnsi="Times New Roman" w:eastAsia="Times New Roman" w:cs="Times New Roman"/>
-          <w:sz w:val="22"/>
-        </w:rPr>
-        <w:t>Mr. Vikas, Assistant Professor</w:t>
-      </w:r>
-    </w:p>
-    <w:p>
-      <w:pPr>
-        <w:keepNext w:val="0"/>
-        <w:keepLines w:val="0"/>
-        <w:pageBreakBefore w:val="0"/>
-        <w:widowControl/>
-        <w:spacing w:line="312" w:lineRule="auto" w:before="0" w:after="240"/>
-        <w:jc w:val="left"/>
-      </w:pPr>
-      <w:r>
-        <w:rPr>
-          <w:rFonts w:ascii="Times New Roman" w:hAnsi="Times New Roman" w:eastAsia="Times New Roman" w:cs="Times New Roman"/>
-          <w:sz w:val="22"/>
-        </w:rPr>
-        <w:t>Signature: ____________________</w:t>
-      </w:r>
-    </w:p>
-    <w:p>
-      <w:pPr>
-        <w:keepNext w:val="0"/>
-        <w:keepLines w:val="0"/>
-        <w:pageBreakBefore w:val="0"/>
-        <w:widowControl/>
-        <w:spacing w:line="312" w:lineRule="auto" w:before="0" w:after="0"/>
-        <w:jc w:val="left"/>
-      </w:pPr>
-      <w:r>
-        <w:rPr>
-          <w:rFonts w:ascii="Times New Roman" w:hAnsi="Times New Roman" w:eastAsia="Times New Roman" w:cs="Times New Roman"/>
-          <w:b/>
-          <w:sz w:val="22"/>
-        </w:rPr>
-        <w:t xml:space="preserve">Project Coordinator: </w:t>
-      </w:r>
-      <w:r>
-        <w:rPr>
-          <w:rFonts w:ascii="Times New Roman" w:hAnsi="Times New Roman" w:eastAsia="Times New Roman" w:cs="Times New Roman"/>
-          <w:sz w:val="22"/>
-        </w:rPr>
-        <w:t>Mr. Vishal Gupta, Assistant Professor</w:t>
-      </w:r>
-    </w:p>
-    <w:p>
-      <w:pPr>
-        <w:keepNext w:val="0"/>
-        <w:keepLines w:val="0"/>
-        <w:pageBreakBefore w:val="0"/>
-        <w:widowControl/>
-        <w:spacing w:line="312" w:lineRule="auto" w:before="0" w:after="240"/>
-        <w:jc w:val="left"/>
-      </w:pPr>
-      <w:r>
-        <w:rPr>
-          <w:rFonts w:ascii="Times New Roman" w:hAnsi="Times New Roman" w:eastAsia="Times New Roman" w:cs="Times New Roman"/>
-          <w:sz w:val="22"/>
-        </w:rPr>
-        <w:t>Signature: ____________________</w:t>
-      </w:r>
-    </w:p>
-    <w:p>
-      <w:pPr>
-        <w:keepNext w:val="0"/>
-        <w:keepLines w:val="0"/>
-        <w:pageBreakBefore w:val="0"/>
-        <w:widowControl/>
-        <w:spacing w:line="312" w:lineRule="auto" w:before="0" w:after="0"/>
-        <w:jc w:val="left"/>
-      </w:pPr>
-      <w:r>
-        <w:rPr>
-          <w:rFonts w:ascii="Times New Roman" w:hAnsi="Times New Roman" w:eastAsia="Times New Roman" w:cs="Times New Roman"/>
-          <w:b/>
-          <w:sz w:val="22"/>
-        </w:rPr>
-        <w:t xml:space="preserve">Deputy Head, Department of CSE: </w:t>
-      </w:r>
-      <w:r>
-        <w:rPr>
-          <w:rFonts w:ascii="Times New Roman" w:hAnsi="Times New Roman" w:eastAsia="Times New Roman" w:cs="Times New Roman"/>
-          <w:sz w:val="22"/>
-        </w:rPr>
-        <w:t>Ms. Deepika Arora, Assistant Professor</w:t>
-      </w:r>
-    </w:p>
-    <w:p>
-      <w:pPr>
-        <w:keepNext w:val="0"/>
-        <w:keepLines w:val="0"/>
-        <w:pageBreakBefore w:val="0"/>
-        <w:widowControl/>
-        <w:spacing w:line="312" w:lineRule="auto" w:before="0" w:after="240"/>
-        <w:jc w:val="left"/>
-      </w:pPr>
-      <w:r>
-        <w:rPr>
-          <w:rFonts w:ascii="Times New Roman" w:hAnsi="Times New Roman" w:eastAsia="Times New Roman" w:cs="Times New Roman"/>
-          <w:sz w:val="22"/>
-        </w:rPr>
-        <w:t>Signature: ____________________</w:t>
-      </w:r>
-    </w:p>
-    <w:p>
-      <w:pPr>
-        <w:keepNext w:val="0"/>
-        <w:keepLines w:val="0"/>
-        <w:pageBreakBefore w:val="0"/>
-        <w:widowControl/>
-        <w:spacing w:line="312" w:lineRule="auto" w:before="0" w:after="0"/>
-        <w:jc w:val="left"/>
-      </w:pPr>
-      <w:r>
-        <w:rPr>
-          <w:rFonts w:ascii="Times New Roman" w:hAnsi="Times New Roman" w:eastAsia="Times New Roman" w:cs="Times New Roman"/>
-          <w:b/>
-          <w:sz w:val="22"/>
-        </w:rPr>
-        <w:t xml:space="preserve">Dean Academics: </w:t>
-      </w:r>
-      <w:r>
-        <w:rPr>
-          <w:rFonts w:ascii="Times New Roman" w:hAnsi="Times New Roman" w:eastAsia="Times New Roman" w:cs="Times New Roman"/>
-          <w:sz w:val="22"/>
-        </w:rPr>
-        <w:t>Prof. (Dr.) Kumud Saxena, Professor</w:t>
-      </w:r>
-    </w:p>
-    <w:p>
-      <w:pPr>
-        <w:keepNext w:val="0"/>
-        <w:keepLines w:val="0"/>
-        <w:pageBreakBefore w:val="0"/>
-        <w:widowControl/>
-        <w:spacing w:line="312" w:lineRule="auto" w:before="0" w:after="240"/>
-        <w:jc w:val="left"/>
-      </w:pPr>
-      <w:r>
-        <w:rPr>
-          <w:rFonts w:ascii="Times New Roman" w:hAnsi="Times New Roman" w:eastAsia="Times New Roman" w:cs="Times New Roman"/>
-          <w:sz w:val="22"/>
-        </w:rPr>
-        <w:t>Signature: ____________________</w:t>
-      </w:r>
-    </w:p>
-    <w:p>
-      <w:pPr>
-        <w:keepNext w:val="0"/>
-        <w:keepLines w:val="0"/>
-        <w:pageBreakBefore w:val="0"/>
-        <w:widowControl/>
-        <w:spacing w:line="312" w:lineRule="auto" w:before="0" w:after="120"/>
+    <w:tbl>
+      <w:tblPr>
+        <w:tblW w:type="auto" w:w="0"/>
+        <w:tblLook w:firstColumn="1" w:firstRow="1" w:lastColumn="0" w:lastRow="0" w:noHBand="0" w:noVBand="1" w:val="04A0"/>
+      </w:tblPr>
+      <w:tblGrid>
+        <w:gridCol w:w="4154"/>
+        <w:gridCol w:w="4154"/>
+      </w:tblGrid>
+      <w:tr>
+        <w:tc>
+          <w:tcPr>
+            <w:tcW w:type="dxa" w:w="4104"/>
+          </w:tcPr>
+          <w:p>
+            <w:pPr>
+              <w:keepNext w:val="0"/>
+              <w:keepLines w:val="0"/>
+              <w:pageBreakBefore w:val="0"/>
+              <w:widowControl/>
+              <w:spacing w:line="276" w:lineRule="auto" w:before="560" w:after="0"/>
+              <w:jc w:val="left"/>
+            </w:pPr>
+            <w:r>
+              <w:rPr>
+                <w:rFonts w:ascii="Times New Roman" w:hAnsi="Times New Roman" w:eastAsia="Times New Roman" w:cs="Times New Roman"/>
+                <w:sz w:val="22"/>
+              </w:rPr>
+              <w:t>______________________</w:t>
+            </w:r>
+          </w:p>
+          <w:p>
+            <w:pPr>
+              <w:keepNext w:val="0"/>
+              <w:keepLines w:val="0"/>
+              <w:pageBreakBefore w:val="0"/>
+              <w:widowControl/>
+              <w:spacing w:line="276" w:lineRule="auto" w:before="40" w:after="0"/>
+              <w:jc w:val="left"/>
+            </w:pPr>
+            <w:r>
+              <w:rPr>
+                <w:rFonts w:ascii="Times New Roman" w:hAnsi="Times New Roman" w:eastAsia="Times New Roman" w:cs="Times New Roman"/>
+                <w:b/>
+                <w:sz w:val="22"/>
+              </w:rPr>
+              <w:t>Mr. Vikas</w:t>
+            </w:r>
+          </w:p>
+          <w:p>
+            <w:pPr>
+              <w:keepNext w:val="0"/>
+              <w:keepLines w:val="0"/>
+              <w:pageBreakBefore w:val="0"/>
+              <w:widowControl/>
+              <w:spacing w:line="276" w:lineRule="auto" w:before="0" w:after="80"/>
+              <w:jc w:val="left"/>
+            </w:pPr>
+            <w:r>
+              <w:rPr>
+                <w:rFonts w:ascii="Times New Roman" w:hAnsi="Times New Roman" w:eastAsia="Times New Roman" w:cs="Times New Roman"/>
+                <w:sz w:val="20"/>
+              </w:rPr>
+              <w:t>Project Guide, Assistant Professor</w:t>
+            </w:r>
+          </w:p>
+        </w:tc>
+        <w:tc>
+          <w:tcPr>
+            <w:tcW w:type="dxa" w:w="4104"/>
+          </w:tcPr>
+          <w:p>
+            <w:pPr>
+              <w:keepNext w:val="0"/>
+              <w:keepLines w:val="0"/>
+              <w:pageBreakBefore w:val="0"/>
+              <w:widowControl/>
+              <w:spacing w:line="276" w:lineRule="auto" w:before="560" w:after="0"/>
+              <w:jc w:val="left"/>
+            </w:pPr>
+            <w:r>
+              <w:rPr>
+                <w:rFonts w:ascii="Times New Roman" w:hAnsi="Times New Roman" w:eastAsia="Times New Roman" w:cs="Times New Roman"/>
+                <w:sz w:val="22"/>
+              </w:rPr>
+              <w:t>______________________</w:t>
+            </w:r>
+          </w:p>
+          <w:p>
+            <w:pPr>
+              <w:keepNext w:val="0"/>
+              <w:keepLines w:val="0"/>
+              <w:pageBreakBefore w:val="0"/>
+              <w:widowControl/>
+              <w:spacing w:line="276" w:lineRule="auto" w:before="40" w:after="0"/>
+              <w:jc w:val="left"/>
+            </w:pPr>
+            <w:r>
+              <w:rPr>
+                <w:rFonts w:ascii="Times New Roman" w:hAnsi="Times New Roman" w:eastAsia="Times New Roman" w:cs="Times New Roman"/>
+                <w:b/>
+                <w:sz w:val="22"/>
+              </w:rPr>
+              <w:t>Mr. Vishal Gupta</w:t>
+            </w:r>
+          </w:p>
+          <w:p>
+            <w:pPr>
+              <w:keepNext w:val="0"/>
+              <w:keepLines w:val="0"/>
+              <w:pageBreakBefore w:val="0"/>
+              <w:widowControl/>
+              <w:spacing w:line="276" w:lineRule="auto" w:before="0" w:after="80"/>
+              <w:jc w:val="left"/>
+            </w:pPr>
+            <w:r>
+              <w:rPr>
+                <w:rFonts w:ascii="Times New Roman" w:hAnsi="Times New Roman" w:eastAsia="Times New Roman" w:cs="Times New Roman"/>
+                <w:sz w:val="20"/>
+              </w:rPr>
+              <w:t>Project Coordinator, Assistant Professor</w:t>
+            </w:r>
+          </w:p>
+        </w:tc>
+      </w:tr>
+      <w:tr>
+        <w:tc>
+          <w:tcPr>
+            <w:tcW w:type="dxa" w:w="4104"/>
+          </w:tcPr>
+          <w:p>
+            <w:pPr>
+              <w:keepNext w:val="0"/>
+              <w:keepLines w:val="0"/>
+              <w:pageBreakBefore w:val="0"/>
+              <w:widowControl/>
+              <w:spacing w:line="276" w:lineRule="auto" w:before="560" w:after="0"/>
+              <w:jc w:val="left"/>
+            </w:pPr>
+            <w:r>
+              <w:rPr>
+                <w:rFonts w:ascii="Times New Roman" w:hAnsi="Times New Roman" w:eastAsia="Times New Roman" w:cs="Times New Roman"/>
+                <w:sz w:val="22"/>
+              </w:rPr>
+              <w:t>______________________</w:t>
+            </w:r>
+          </w:p>
+          <w:p>
+            <w:pPr>
+              <w:keepNext w:val="0"/>
+              <w:keepLines w:val="0"/>
+              <w:pageBreakBefore w:val="0"/>
+              <w:widowControl/>
+              <w:spacing w:line="276" w:lineRule="auto" w:before="40" w:after="0"/>
+              <w:jc w:val="left"/>
+            </w:pPr>
+            <w:r>
+              <w:rPr>
+                <w:rFonts w:ascii="Times New Roman" w:hAnsi="Times New Roman" w:eastAsia="Times New Roman" w:cs="Times New Roman"/>
+                <w:b/>
+                <w:sz w:val="22"/>
+              </w:rPr>
+              <w:t>Ms. Deepika Arora</w:t>
+            </w:r>
+          </w:p>
+          <w:p>
+            <w:pPr>
+              <w:keepNext w:val="0"/>
+              <w:keepLines w:val="0"/>
+              <w:pageBreakBefore w:val="0"/>
+              <w:widowControl/>
+              <w:spacing w:line="276" w:lineRule="auto" w:before="0" w:after="80"/>
+              <w:jc w:val="left"/>
+            </w:pPr>
+            <w:r>
+              <w:rPr>
+                <w:rFonts w:ascii="Times New Roman" w:hAnsi="Times New Roman" w:eastAsia="Times New Roman" w:cs="Times New Roman"/>
+                <w:sz w:val="20"/>
+              </w:rPr>
+              <w:t>Deputy Head, Department of CSE, Assistant Professor</w:t>
+            </w:r>
+          </w:p>
+        </w:tc>
+        <w:tc>
+          <w:tcPr>
+            <w:tcW w:type="dxa" w:w="4104"/>
+          </w:tcPr>
+          <w:p>
+            <w:pPr>
+              <w:keepNext w:val="0"/>
+              <w:keepLines w:val="0"/>
+              <w:pageBreakBefore w:val="0"/>
+              <w:widowControl/>
+              <w:spacing w:line="276" w:lineRule="auto" w:before="560" w:after="0"/>
+              <w:jc w:val="left"/>
+            </w:pPr>
+            <w:r>
+              <w:rPr>
+                <w:rFonts w:ascii="Times New Roman" w:hAnsi="Times New Roman" w:eastAsia="Times New Roman" w:cs="Times New Roman"/>
+                <w:sz w:val="22"/>
+              </w:rPr>
+              <w:t>______________________</w:t>
+            </w:r>
+          </w:p>
+          <w:p>
+            <w:pPr>
+              <w:keepNext w:val="0"/>
+              <w:keepLines w:val="0"/>
+              <w:pageBreakBefore w:val="0"/>
+              <w:widowControl/>
+              <w:spacing w:line="276" w:lineRule="auto" w:before="40" w:after="0"/>
+              <w:jc w:val="left"/>
+            </w:pPr>
+            <w:r>
+              <w:rPr>
+                <w:rFonts w:ascii="Times New Roman" w:hAnsi="Times New Roman" w:eastAsia="Times New Roman" w:cs="Times New Roman"/>
+                <w:b/>
+                <w:sz w:val="22"/>
+              </w:rPr>
+              <w:t>Prof. (Dr.) Kumud Saxena</w:t>
+            </w:r>
+          </w:p>
+          <w:p>
+            <w:pPr>
+              <w:keepNext w:val="0"/>
+              <w:keepLines w:val="0"/>
+              <w:pageBreakBefore w:val="0"/>
+              <w:widowControl/>
+              <w:spacing w:line="276" w:lineRule="auto" w:before="0" w:after="80"/>
+              <w:jc w:val="left"/>
+            </w:pPr>
+            <w:r>
+              <w:rPr>
+                <w:rFonts w:ascii="Times New Roman" w:hAnsi="Times New Roman" w:eastAsia="Times New Roman" w:cs="Times New Roman"/>
+                <w:sz w:val="20"/>
+              </w:rPr>
+              <w:t>Dean Academics, Professor</w:t>
+            </w:r>
+          </w:p>
+        </w:tc>
+      </w:tr>
+    </w:tbl>
+    <w:p>
+      <w:pPr>
+        <w:keepNext w:val="0"/>
+        <w:keepLines w:val="0"/>
+        <w:pageBreakBefore w:val="0"/>
+        <w:widowControl/>
+        <w:spacing w:line="312" w:lineRule="auto" w:before="360" w:after="120"/>
         <w:jc w:val="left"/>
       </w:pPr>
       <w:r>

</xml_diff>

<commit_message>
Certificate: three signatories in one row, place below date
</commit_message>
<xml_diff>
--- a/report/NIDS_Mini_Project_Report.docx
+++ b/report/NIDS_Mini_Project_Report.docx
@@ -841,21 +841,22 @@
         <w:tblLook w:firstColumn="1" w:firstRow="1" w:lastColumn="0" w:lastRow="0" w:noHBand="0" w:noVBand="1" w:val="04A0"/>
       </w:tblPr>
       <w:tblGrid>
-        <w:gridCol w:w="4154"/>
-        <w:gridCol w:w="4154"/>
+        <w:gridCol w:w="2770"/>
+        <w:gridCol w:w="2770"/>
+        <w:gridCol w:w="2770"/>
       </w:tblGrid>
       <w:tr>
         <w:tc>
           <w:tcPr>
-            <w:tcW w:type="dxa" w:w="4104"/>
-          </w:tcPr>
-          <w:p>
-            <w:pPr>
-              <w:keepNext w:val="0"/>
-              <w:keepLines w:val="0"/>
-              <w:pageBreakBefore w:val="0"/>
-              <w:widowControl/>
-              <w:spacing w:line="276" w:lineRule="auto" w:before="560" w:after="0"/>
+            <w:tcW w:type="dxa" w:w="2765"/>
+          </w:tcPr>
+          <w:p>
+            <w:pPr>
+              <w:keepNext w:val="0"/>
+              <w:keepLines w:val="0"/>
+              <w:pageBreakBefore w:val="0"/>
+              <w:widowControl/>
+              <w:spacing w:line="276" w:lineRule="auto" w:before="600" w:after="0"/>
               <w:jc w:val="left"/>
             </w:pPr>
             <w:r>
@@ -863,7 +864,7 @@
                 <w:rFonts w:ascii="Times New Roman" w:hAnsi="Times New Roman" w:eastAsia="Times New Roman" w:cs="Times New Roman"/>
                 <w:sz w:val="22"/>
               </w:rPr>
-              <w:t>______________________</w:t>
+              <w:t>__________________</w:t>
             </w:r>
           </w:p>
           <w:p>
@@ -904,15 +905,15 @@
         </w:tc>
         <w:tc>
           <w:tcPr>
-            <w:tcW w:type="dxa" w:w="4104"/>
-          </w:tcPr>
-          <w:p>
-            <w:pPr>
-              <w:keepNext w:val="0"/>
-              <w:keepLines w:val="0"/>
-              <w:pageBreakBefore w:val="0"/>
-              <w:widowControl/>
-              <w:spacing w:line="276" w:lineRule="auto" w:before="560" w:after="0"/>
+            <w:tcW w:type="dxa" w:w="2765"/>
+          </w:tcPr>
+          <w:p>
+            <w:pPr>
+              <w:keepNext w:val="0"/>
+              <w:keepLines w:val="0"/>
+              <w:pageBreakBefore w:val="0"/>
+              <w:widowControl/>
+              <w:spacing w:line="276" w:lineRule="auto" w:before="600" w:after="0"/>
               <w:jc w:val="left"/>
             </w:pPr>
             <w:r>
@@ -920,7 +921,7 @@
                 <w:rFonts w:ascii="Times New Roman" w:hAnsi="Times New Roman" w:eastAsia="Times New Roman" w:cs="Times New Roman"/>
                 <w:sz w:val="22"/>
               </w:rPr>
-              <w:t>______________________</w:t>
+              <w:t>__________________</w:t>
             </w:r>
           </w:p>
           <w:p>
@@ -959,19 +960,17 @@
             </w:r>
           </w:p>
         </w:tc>
-      </w:tr>
-      <w:tr>
-        <w:tc>
-          <w:tcPr>
-            <w:tcW w:type="dxa" w:w="4104"/>
-          </w:tcPr>
-          <w:p>
-            <w:pPr>
-              <w:keepNext w:val="0"/>
-              <w:keepLines w:val="0"/>
-              <w:pageBreakBefore w:val="0"/>
-              <w:widowControl/>
-              <w:spacing w:line="276" w:lineRule="auto" w:before="560" w:after="0"/>
+        <w:tc>
+          <w:tcPr>
+            <w:tcW w:type="dxa" w:w="2765"/>
+          </w:tcPr>
+          <w:p>
+            <w:pPr>
+              <w:keepNext w:val="0"/>
+              <w:keepLines w:val="0"/>
+              <w:pageBreakBefore w:val="0"/>
+              <w:widowControl/>
+              <w:spacing w:line="276" w:lineRule="auto" w:before="600" w:after="0"/>
               <w:jc w:val="left"/>
             </w:pPr>
             <w:r>
@@ -979,7 +978,7 @@
                 <w:rFonts w:ascii="Times New Roman" w:hAnsi="Times New Roman" w:eastAsia="Times New Roman" w:cs="Times New Roman"/>
                 <w:sz w:val="22"/>
               </w:rPr>
-              <w:t>______________________</w:t>
+              <w:t>__________________</w:t>
             </w:r>
           </w:p>
           <w:p>
@@ -1018,63 +1017,6 @@
             </w:r>
           </w:p>
         </w:tc>
-        <w:tc>
-          <w:tcPr>
-            <w:tcW w:type="dxa" w:w="4104"/>
-          </w:tcPr>
-          <w:p>
-            <w:pPr>
-              <w:keepNext w:val="0"/>
-              <w:keepLines w:val="0"/>
-              <w:pageBreakBefore w:val="0"/>
-              <w:widowControl/>
-              <w:spacing w:line="276" w:lineRule="auto" w:before="560" w:after="0"/>
-              <w:jc w:val="left"/>
-            </w:pPr>
-            <w:r>
-              <w:rPr>
-                <w:rFonts w:ascii="Times New Roman" w:hAnsi="Times New Roman" w:eastAsia="Times New Roman" w:cs="Times New Roman"/>
-                <w:sz w:val="22"/>
-              </w:rPr>
-              <w:t>______________________</w:t>
-            </w:r>
-          </w:p>
-          <w:p>
-            <w:pPr>
-              <w:keepNext w:val="0"/>
-              <w:keepLines w:val="0"/>
-              <w:pageBreakBefore w:val="0"/>
-              <w:widowControl/>
-              <w:spacing w:line="276" w:lineRule="auto" w:before="40" w:after="0"/>
-              <w:jc w:val="left"/>
-            </w:pPr>
-            <w:r>
-              <w:rPr>
-                <w:rFonts w:ascii="Times New Roman" w:hAnsi="Times New Roman" w:eastAsia="Times New Roman" w:cs="Times New Roman"/>
-                <w:b/>
-                <w:sz w:val="22"/>
-              </w:rPr>
-              <w:t>Prof. (Dr.) Kumud Saxena</w:t>
-            </w:r>
-          </w:p>
-          <w:p>
-            <w:pPr>
-              <w:keepNext w:val="0"/>
-              <w:keepLines w:val="0"/>
-              <w:pageBreakBefore w:val="0"/>
-              <w:widowControl/>
-              <w:spacing w:line="276" w:lineRule="auto" w:before="0" w:after="80"/>
-              <w:jc w:val="left"/>
-            </w:pPr>
-            <w:r>
-              <w:rPr>
-                <w:rFonts w:ascii="Times New Roman" w:hAnsi="Times New Roman" w:eastAsia="Times New Roman" w:cs="Times New Roman"/>
-                <w:sz w:val="20"/>
-              </w:rPr>
-              <w:t>Dean Academics, Professor</w:t>
-            </w:r>
-          </w:p>
-        </w:tc>
       </w:tr>
     </w:tbl>
     <w:p>
@@ -1083,15 +1025,32 @@
         <w:keepLines w:val="0"/>
         <w:pageBreakBefore w:val="0"/>
         <w:widowControl/>
-        <w:spacing w:line="312" w:lineRule="auto" w:before="360" w:after="120"/>
-        <w:jc w:val="left"/>
-      </w:pPr>
-      <w:r>
-        <w:rPr>
-          <w:rFonts w:ascii="Times New Roman" w:hAnsi="Times New Roman" w:eastAsia="Times New Roman" w:cs="Times New Roman"/>
-          <w:sz w:val="22"/>
-        </w:rPr>
-        <w:t>Date: ______________        Place: Greater Noida</w:t>
+        <w:spacing w:line="312" w:lineRule="auto" w:before="400" w:after="40"/>
+        <w:jc w:val="left"/>
+      </w:pPr>
+      <w:r>
+        <w:rPr>
+          <w:rFonts w:ascii="Times New Roman" w:hAnsi="Times New Roman" w:eastAsia="Times New Roman" w:cs="Times New Roman"/>
+          <w:sz w:val="22"/>
+        </w:rPr>
+        <w:t>Date: ______________</w:t>
+      </w:r>
+    </w:p>
+    <w:p>
+      <w:pPr>
+        <w:keepNext w:val="0"/>
+        <w:keepLines w:val="0"/>
+        <w:pageBreakBefore w:val="0"/>
+        <w:widowControl/>
+        <w:spacing w:line="312" w:lineRule="auto" w:before="0" w:after="120"/>
+        <w:jc w:val="left"/>
+      </w:pPr>
+      <w:r>
+        <w:rPr>
+          <w:rFonts w:ascii="Times New Roman" w:hAnsi="Times New Roman" w:eastAsia="Times New Roman" w:cs="Times New Roman"/>
+          <w:sz w:val="22"/>
+        </w:rPr>
+        <w:t>Place: Greater Noida</w:t>
       </w:r>
     </w:p>
     <w:p>

</xml_diff>